<commit_message>
Redraw per-grid speedup figure as paired absolute-time bars
The single-ratio-bar version of Fig. 1b required a reader to mentally
reconstruct two solvers' actual performance from one abstracted number
per grid. Redrew it as grouped bars showing each solver's actual wall
time per grid side by side (xfill vs. orca-solver), with the speedup
ratio kept as a label above each pair rather than the whole story --
same underlying numbers, but now both solvers' absolute performance is
directly visible per grid, not just the ratio between them.

Updated the figure caption to match, and trimmed it slightly (plus a
neighboring caption last commit already tightened) to hold the paper at
exactly 5 pages -- verified via tectonic + pypdf. Regenerated the docx
and all figures. All 29 C++ tests still pass.

Co-Authored-By: Claude Sonnet 5 <noreply@anthropic.com>
</commit_message>
<xml_diff>
--- a/paper/xfill_urtc2026.docx
+++ b/paper/xfill_urtc2026.docx
@@ -1578,7 +1578,7 @@
       <w:r>
         <w:drawing>
           <wp:inline>
-            <wp:extent cx="5334000" cy="2683915"/>
+            <wp:extent cx="5334000" cy="2771051"/>
             <wp:effectExtent b="0" l="0" r="0" t="0"/>
             <wp:docPr descr="" title="" id="26" name="Picture"/>
             <a:graphic>
@@ -1599,7 +1599,7 @@
                   <pic:spPr bwMode="auto">
                     <a:xfrm>
                       <a:off x="0" y="0"/>
-                      <a:ext cx="5334000" cy="2683915"/>
+                      <a:ext cx="5334000" cy="2771051"/>
                     </a:xfrm>
                     <a:prstGeom prst="rect">
                       <a:avLst/>
@@ -1623,7 +1623,7 @@
         <w:pStyle w:val="ImageCaption"/>
       </w:pPr>
       <w:r>
-        <w:t xml:space="preserve">Per-grid speedup (orca-solver time / xfill time, log scale) on the scraped</w:t>
+        <w:t xml:space="preserve">Wall time to solve (log scale), xfill vs. orca-solver, per scraped</w:t>
       </w:r>
       <w:r>
         <w:t xml:space="preserve"> </w:t>
@@ -1646,7 +1646,22 @@
         <w:t xml:space="preserve"> </w:t>
       </w:r>
       <w:r>
-        <w:t xml:space="preserve">grids both solvers solved. Bars above the line mean xfill is faster; only one of 10 falls below it.</w:t>
+        <w:t xml:space="preserve">grid both solved. Label is orca-solver time / xfill time; only</w:t>
+      </w:r>
+      <w:r>
+        <w:t xml:space="preserve"> </w:t>
+      </w:r>
+      <w:r>
+        <w:rPr>
+          <w:rStyle w:val="VerbatimChar"/>
+        </w:rPr>
+        <w:t xml:space="preserve">grid_479</w:t>
+      </w:r>
+      <w:r>
+        <w:t xml:space="preserve"> </w:t>
+      </w:r>
+      <w:r>
+        <w:t xml:space="preserve">favors orca-solver.</w:t>
       </w:r>
     </w:p>
     <w:bookmarkEnd w:id="28"/>

</xml_diff>

<commit_message>
Escalate benchmark timeout cap to 1000s, matching the 10^3 axis label
Every remaining timeout was re-tested at 1000s (up from 600s) and held:
zero of the 17 re-tested pairs changed status, strengthening the "hard,
not under-budgeted" claim from the earlier 300s->600s escalation.
Regenerates all results-dependent figures and updates every cap
reference in the paper text to match the real data now backing the
axis's honest 10^3 tick.

Co-Authored-By: Claude Sonnet 5 <noreply@anthropic.com>
</commit_message>
<xml_diff>
--- a/paper/xfill_urtc2026.docx
+++ b/paper/xfill_urtc2026.docx
@@ -557,7 +557,7 @@
           <w:rPr>
             <w:rStyle w:val="Hyperlink"/>
           </w:rPr>
-          <w:t xml:space="preserve">5.7</w:t>
+          <w:t xml:space="preserve">5.2</w:t>
         </w:r>
       </w:hyperlink>
       <w:r>
@@ -609,7 +609,7 @@
           <w:rPr>
             <w:rStyle w:val="Hyperlink"/>
           </w:rPr>
-          <w:t xml:space="preserve">5.2</w:t>
+          <w:t xml:space="preserve">5.3</w:t>
         </w:r>
       </w:hyperlink>
       <w:r>
@@ -650,7 +650,7 @@
           <w:rPr>
             <w:rStyle w:val="Hyperlink"/>
           </w:rPr>
-          <w:t xml:space="preserve">5.2</w:t>
+          <w:t xml:space="preserve">5.3</w:t>
         </w:r>
       </w:hyperlink>
       <w:r>
@@ -692,9 +692,9 @@
         </w:r>
       </w:hyperlink>
       <w:r>
-        <w:t xml:space="preserve">’s fix – test two distinct claims, and we keep them in separate subsections rather than blending them. Sections </w:t>
-      </w:r>
-      <w:hyperlink w:anchor="sec:oversub">
+        <w:t xml:space="preserve">’s fix – test two distinct claims, kept in separate subsections rather than blended together. Section </w:t>
+      </w:r>
+      <w:hyperlink w:anchor="sec:ablation">
         <w:r>
           <w:rPr>
             <w:rStyle w:val="Hyperlink"/>
@@ -703,9 +703,532 @@
         </w:r>
       </w:hyperlink>
       <w:r>
+        <w:t xml:space="preserve"> </w:t>
+      </w:r>
+      <w:r>
+        <w:t xml:space="preserve">isolates the mechanism itself first, holding architecture fixed, since that is this paper’s actual contribution. Sections </w:t>
+      </w:r>
+      <w:hyperlink w:anchor="sec:oversub">
+        <w:r>
+          <w:rPr>
+            <w:rStyle w:val="Hyperlink"/>
+          </w:rPr>
+          <w:t xml:space="preserve">5.3</w:t>
+        </w:r>
+      </w:hyperlink>
+      <w:r>
         <w:t xml:space="preserve">–</w:t>
       </w:r>
       <w:hyperlink w:anchor="sec:exhaustive">
+        <w:r>
+          <w:rPr>
+            <w:rStyle w:val="Hyperlink"/>
+          </w:rPr>
+          <w:t xml:space="preserve">5.7</w:t>
+        </w:r>
+      </w:hyperlink>
+      <w:r>
+        <w:t xml:space="preserve"> </w:t>
+      </w:r>
+      <w:r>
+        <w:t xml:space="preserve">then test whether restart-portfolio search, as an architectural class, occupies a genuinely different point in the design space than partition-based search – using orca-solver as a concrete, independently developed representative of that alternative, and an unmodified naive backtracker to show the comparison is not trivial. That architectural comparison is context for why the mechanism is worth building, not a prerequisite to testing it.</w:t>
+      </w:r>
+    </w:p>
+    <w:p>
+      <w:pPr>
+        <w:pStyle w:val="BodyText"/>
+      </w:pPr>
+      <w:r>
+        <w:rPr>
+          <w:b/>
+          <w:bCs/>
+        </w:rPr>
+        <w:t xml:space="preserve">Solvers.</w:t>
+      </w:r>
+      <w:r>
+        <w:t xml:space="preserve"> </w:t>
+      </w:r>
+      <w:r>
+        <w:t xml:space="preserve">xfill (this work); orca-solver, a partition-based parallel solver treated as a black box; ingrid_core, a single-threaded reference solver; and, as a naive baseline with no restarts, no learned heuristics, and no parallelism, crossword-composer (a static-constraint-order Rust backtracker). All four run through a single fixed harness (</w:t>
+      </w:r>
+      <w:r>
+        <w:rPr>
+          <w:rStyle w:val="VerbatimChar"/>
+        </w:rPr>
+        <w:t xml:space="preserve">benchmarks/urtc2026_testbench/</w:t>
+      </w:r>
+      <w:r>
+        <w:t xml:space="preserve">), against a dictionary derived deterministically from the repository’s own freely available word list, with a fixed seed and a 300-second cap, reproducible via</w:t>
+      </w:r>
+      <w:r>
+        <w:t xml:space="preserve"> </w:t>
+      </w:r>
+      <w:r>
+        <w:rPr>
+          <w:rStyle w:val="VerbatimChar"/>
+        </w:rPr>
+        <w:t xml:space="preserve">run_benchmark.py</w:t>
+      </w:r>
+      <w:r>
+        <w:t xml:space="preserve">; every timeout was re-tested at 600s, then again at 1000s, via</w:t>
+      </w:r>
+      <w:r>
+        <w:t xml:space="preserve"> </w:t>
+      </w:r>
+      <w:r>
+        <w:rPr>
+          <w:rStyle w:val="VerbatimChar"/>
+        </w:rPr>
+        <w:t xml:space="preserve">rerun_timeouts.py</w:t>
+      </w:r>
+      <w:r>
+        <w:t xml:space="preserve"> </w:t>
+      </w:r>
+      <w:r>
+        <w:t xml:space="preserve">to rule out an under-provisioned cap (Section </w:t>
+      </w:r>
+      <w:hyperlink w:anchor="sec:naive">
+        <w:r>
+          <w:rPr>
+            <w:rStyle w:val="Hyperlink"/>
+          </w:rPr>
+          <w:t xml:space="preserve">5.5</w:t>
+        </w:r>
+      </w:hyperlink>
+      <w:r>
+        <w:t xml:space="preserve">). xfill and orca-solver race independent workers, so wall time varies run to run; each runs 5 times per grid, median reported, every trial logged. ingrid_core and crossword-composer are single-threaded and deterministic, so each runs once.</w:t>
+      </w:r>
+    </w:p>
+    <w:p>
+      <w:pPr>
+        <w:pStyle w:val="BodyText"/>
+      </w:pPr>
+      <w:r>
+        <w:rPr>
+          <w:b/>
+          <w:bCs/>
+        </w:rPr>
+        <w:t xml:space="preserve">Grid set.</w:t>
+      </w:r>
+      <w:r>
+        <w:t xml:space="preserve"> </w:t>
+      </w:r>
+      <w:r>
+        <w:t xml:space="preserve">A size-graded curated set (</w:t>
+      </w:r>
+      <m:oMath>
+        <m:r>
+          <m:t>5</m:t>
+        </m:r>
+        <m:r>
+          <m:rPr>
+            <m:sty m:val="p"/>
+          </m:rPr>
+          <m:t>×</m:t>
+        </m:r>
+        <m:r>
+          <m:t>5</m:t>
+        </m:r>
+      </m:oMath>
+      <w:r>
+        <w:t xml:space="preserve"> </w:t>
+      </w:r>
+      <w:r>
+        <w:t xml:space="preserve">through</w:t>
+      </w:r>
+      <w:r>
+        <w:t xml:space="preserve"> </w:t>
+      </w:r>
+      <m:oMath>
+        <m:r>
+          <m:t>21</m:t>
+        </m:r>
+        <m:r>
+          <m:rPr>
+            <m:sty m:val="p"/>
+          </m:rPr>
+          <m:t>×</m:t>
+        </m:r>
+        <m:r>
+          <m:t>21</m:t>
+        </m:r>
+      </m:oMath>
+      <w:r>
+        <w:t xml:space="preserve">) plus a fixed-seed random sample of</w:t>
+      </w:r>
+      <w:r>
+        <w:t xml:space="preserve"> </w:t>
+      </w:r>
+      <m:oMath>
+        <m:r>
+          <m:t>15</m:t>
+        </m:r>
+        <m:r>
+          <m:rPr>
+            <m:sty m:val="p"/>
+          </m:rPr>
+          <m:t>×</m:t>
+        </m:r>
+        <m:r>
+          <m:t>15</m:t>
+        </m:r>
+      </m:oMath>
+      <w:r>
+        <w:t xml:space="preserve"> </w:t>
+      </w:r>
+      <w:r>
+        <w:t xml:space="preserve">grids scraped from a public corpus of real, previously published crossword layouts, crosswordgrids.com</w:t>
+      </w:r>
+      <w:r>
+        <w:t xml:space="preserve"> </w:t>
+      </w:r>
+      <w:r>
+        <w:t xml:space="preserve">, all committed to the repository.</w:t>
+      </w:r>
+    </w:p>
+    <w:bookmarkEnd w:id="13"/>
+    <w:bookmarkStart w:id="18" w:name="sec:ablation"/>
+    <w:p>
+      <w:pPr>
+        <w:pStyle w:val="Heading2"/>
+      </w:pPr>
+      <w:r>
+        <w:t xml:space="preserve">Isolating the Mechanism: A Shared-Weight Ablation</w:t>
+      </w:r>
+    </w:p>
+    <w:p>
+      <w:pPr>
+        <w:pStyle w:val="FirstParagraph"/>
+      </w:pPr>
+      <w:r>
+        <w:t xml:space="preserve">This section tests xfill against itself: same solver, same grid, same dictionary, same 14 threads, one environment variable flipped,</w:t>
+      </w:r>
+      <w:r>
+        <w:t xml:space="preserve"> </w:t>
+      </w:r>
+      <w:r>
+        <w:rPr>
+          <w:rStyle w:val="VerbatimChar"/>
+        </w:rPr>
+        <w:t xml:space="preserve">XFILL_DISABLE_SHARED_WEIGHTS</w:t>
+      </w:r>
+      <w:r>
+        <w:t xml:space="preserve"> </w:t>
+      </w:r>
+      <w:r>
+        <w:t xml:space="preserve">on and off, several trials each, on grids from two independent sources – a fixed</w:t>
+      </w:r>
+      <w:r>
+        <w:t xml:space="preserve"> </w:t>
+      </w:r>
+      <w:r>
+        <w:t xml:space="preserve">“known-hard”</w:t>
+      </w:r>
+      <w:r>
+        <w:t xml:space="preserve"> </w:t>
+      </w:r>
+      <w:r>
+        <w:t xml:space="preserve">grid list reused from this project’s own earlier development-time benchmarking (not cherry-picked for this paper; the same list anchors the thread-count scaling result in Section </w:t>
+      </w:r>
+      <w:hyperlink w:anchor="sec:oversub">
+        <w:r>
+          <w:rPr>
+            <w:rStyle w:val="Hyperlink"/>
+          </w:rPr>
+          <w:t xml:space="preserve">5.3</w:t>
+        </w:r>
+      </w:hyperlink>
+      <w:r>
+        <w:t xml:space="preserve">), and three grids from the paper’s own main scraped-</w:t>
+      </w:r>
+      <m:oMath>
+        <m:r>
+          <m:t>15</m:t>
+        </m:r>
+        <m:r>
+          <m:rPr>
+            <m:sty m:val="p"/>
+          </m:rPr>
+          <m:t>×</m:t>
+        </m:r>
+        <m:r>
+          <m:t>15</m:t>
+        </m:r>
+      </m:oMath>
+      <w:r>
+        <w:t xml:space="preserve"> </w:t>
+      </w:r>
+      <w:r>
+        <w:t xml:space="preserve">corpus, to check the result is not an artifact of one curated list.</w:t>
+      </w:r>
+    </w:p>
+    <w:bookmarkStart w:id="17" w:name="fig:ablation"/>
+    <w:p>
+      <w:pPr>
+        <w:pStyle w:val="CaptionedFigure"/>
+      </w:pPr>
+      <w:r>
+        <w:drawing>
+          <wp:inline>
+            <wp:extent cx="5067300" cy="955877"/>
+            <wp:effectExtent b="0" l="0" r="0" t="0"/>
+            <wp:docPr descr="" title="" id="15" name="Picture"/>
+            <a:graphic>
+              <a:graphicData uri="http://schemas.openxmlformats.org/drawingml/2006/picture">
+                <pic:pic>
+                  <pic:nvPicPr>
+                    <pic:cNvPr descr="../benchmarks/urtc2026_testbench/results/figures/fig4_ablation.pdf" id="16" name="Picture"/>
+                    <pic:cNvPicPr>
+                      <a:picLocks noChangeArrowheads="1" noChangeAspect="1"/>
+                    </pic:cNvPicPr>
+                  </pic:nvPicPr>
+                  <pic:blipFill>
+                    <a:blip r:embed="rId14"/>
+                    <a:stretch>
+                      <a:fillRect/>
+                    </a:stretch>
+                  </pic:blipFill>
+                  <pic:spPr bwMode="auto">
+                    <a:xfrm>
+                      <a:off x="0" y="0"/>
+                      <a:ext cx="5067300" cy="955877"/>
+                    </a:xfrm>
+                    <a:prstGeom prst="rect">
+                      <a:avLst/>
+                    </a:prstGeom>
+                    <a:noFill/>
+                    <a:ln w="9525">
+                      <a:noFill/>
+                      <a:headEnd/>
+                      <a:tailEnd/>
+                    </a:ln>
+                  </pic:spPr>
+                </pic:pic>
+              </a:graphicData>
+            </a:graphic>
+          </wp:inline>
+        </w:drawing>
+      </w:r>
+    </w:p>
+    <w:p>
+      <w:pPr>
+        <w:pStyle w:val="ImageCaption"/>
+      </w:pPr>
+      <w:r>
+        <w:t xml:space="preserve">Shared-conflict-weight ablation, off vs. on, 14 threads: a known-hard grid list also used in Fig. </w:t>
+      </w:r>
+      <w:hyperlink w:anchor="fig:scaling">
+        <w:r>
+          <w:rPr>
+            <w:rStyle w:val="Hyperlink"/>
+          </w:rPr>
+          <w:t xml:space="preserve">2</w:t>
+        </w:r>
+      </w:hyperlink>
+      <w:r>
+        <w:t xml:space="preserve"> </w:t>
+      </w:r>
+      <w:r>
+        <w:t xml:space="preserve">(left three, 6 trials, 45s cap) and three grids from the paper’s own scraped-</w:t>
+      </w:r>
+      <m:oMath>
+        <m:r>
+          <m:t>15</m:t>
+        </m:r>
+        <m:r>
+          <m:rPr>
+            <m:sty m:val="p"/>
+          </m:rPr>
+          <m:t>×</m:t>
+        </m:r>
+        <m:r>
+          <m:t>15</m:t>
+        </m:r>
+      </m:oMath>
+      <w:r>
+        <w:t xml:space="preserve"> </w:t>
+      </w:r>
+      <w:r>
+        <w:t xml:space="preserve">corpus (right three, 5 trials, 300s cap; the other 9 of 12 solve in under a second and are omitted). Bars mark the median; hollow points hit the cap. Shared weights are not uniformly better: the same win/wash/loss pattern appears independently on both grid sets.</w:t>
+      </w:r>
+    </w:p>
+    <w:bookmarkEnd w:id="17"/>
+    <w:p>
+      <w:pPr>
+        <w:pStyle w:val="BodyText"/>
+      </w:pPr>
+      <w:r>
+        <w:t xml:space="preserve">Fig. </w:t>
+      </w:r>
+      <w:hyperlink w:anchor="fig:ablation">
+        <w:r>
+          <w:rPr>
+            <w:rStyle w:val="Hyperlink"/>
+          </w:rPr>
+          <w:t xml:space="preserve">1</w:t>
+        </w:r>
+      </w:hyperlink>
+      <w:r>
+        <w:t xml:space="preserve"> </w:t>
+      </w:r>
+      <w:r>
+        <w:t xml:space="preserve">does</w:t>
+      </w:r>
+      <w:r>
+        <w:t xml:space="preserve"> </w:t>
+      </w:r>
+      <w:r>
+        <w:rPr>
+          <w:i/>
+          <w:iCs/>
+        </w:rPr>
+        <w:t xml:space="preserve">not</w:t>
+      </w:r>
+      <w:r>
+        <w:t xml:space="preserve"> </w:t>
+      </w:r>
+      <w:r>
+        <w:t xml:space="preserve">show a uniform win, on either grid set, and we report that plainly. On</w:t>
+      </w:r>
+      <w:r>
+        <w:t xml:space="preserve"> </w:t>
+      </w:r>
+      <w:r>
+        <w:rPr>
+          <w:rStyle w:val="VerbatimChar"/>
+        </w:rPr>
+        <w:t xml:space="preserve">grid_053</w:t>
+      </w:r>
+      <w:r>
+        <w:t xml:space="preserve">, the unshared baseline is faster on the median (0.72s vs. 2.77s) and far tighter (0.66–0.76s vs. 0.07–3.71s). On</w:t>
+      </w:r>
+      <w:r>
+        <w:t xml:space="preserve"> </w:t>
+      </w:r>
+      <w:r>
+        <w:rPr>
+          <w:rStyle w:val="VerbatimChar"/>
+        </w:rPr>
+        <w:t xml:space="preserve">grid_058</w:t>
+      </w:r>
+      <w:r>
+        <w:t xml:space="preserve"> </w:t>
+      </w:r>
+      <w:r>
+        <w:t xml:space="preserve">and</w:t>
+      </w:r>
+      <w:r>
+        <w:t xml:space="preserve"> </w:t>
+      </w:r>
+      <w:r>
+        <w:rPr>
+          <w:rStyle w:val="VerbatimChar"/>
+        </w:rPr>
+        <w:t xml:space="preserve">grid_479</w:t>
+      </w:r>
+      <w:r>
+        <w:t xml:space="preserve">, medians are similar but shared weights show wider spread. On</w:t>
+      </w:r>
+      <w:r>
+        <w:t xml:space="preserve"> </w:t>
+      </w:r>
+      <w:r>
+        <w:rPr>
+          <w:rStyle w:val="VerbatimChar"/>
+        </w:rPr>
+        <w:t xml:space="preserve">grid_120</w:t>
+      </w:r>
+      <w:r>
+        <w:t xml:space="preserve">, shared weights reach a lower best case but also produce the only outright timeout among those eighteen trials.</w:t>
+      </w:r>
+      <w:r>
+        <w:t xml:space="preserve"> </w:t>
+      </w:r>
+      <w:r>
+        <w:rPr>
+          <w:rStyle w:val="VerbatimChar"/>
+        </w:rPr>
+        <w:t xml:space="preserve">grid_395</w:t>
+      </w:r>
+      <w:r>
+        <w:t xml:space="preserve"> </w:t>
+      </w:r>
+      <w:r>
+        <w:t xml:space="preserve">and</w:t>
+      </w:r>
+      <w:r>
+        <w:t xml:space="preserve"> </w:t>
+      </w:r>
+      <w:r>
+        <w:rPr>
+          <w:rStyle w:val="VerbatimChar"/>
+        </w:rPr>
+        <w:t xml:space="preserve">grid_423</w:t>
+      </w:r>
+      <w:r>
+        <w:t xml:space="preserve"> </w:t>
+      </w:r>
+      <w:r>
+        <w:t xml:space="preserve">sharpen both directions: a clean</w:t>
+      </w:r>
+      <w:r>
+        <w:t xml:space="preserve"> </w:t>
+      </w:r>
+      <m:oMath>
+        <m:r>
+          <m:t>7</m:t>
+        </m:r>
+      </m:oMath>
+      <w:r>
+        <w:t xml:space="preserve">–</w:t>
+      </w:r>
+      <m:oMath>
+        <m:r>
+          <m:t>10</m:t>
+        </m:r>
+        <m:r>
+          <m:rPr>
+            <m:sty m:val="p"/>
+          </m:rPr>
+          <m:t>×</m:t>
+        </m:r>
+      </m:oMath>
+      <w:r>
+        <w:t xml:space="preserve"> </w:t>
+      </w:r>
+      <w:r>
+        <w:t xml:space="preserve">win on the former (36.9s vs. 271.4s median), and actively worse on the latter – all 5 trials hit the 300s cap, where disabling shared weights solves it reliably at</w:t>
+      </w:r>
+      <w:r>
+        <w:t xml:space="preserve"> </w:t>
+      </w:r>
+      <m:oMath>
+        <m:r>
+          <m:rPr>
+            <m:sty m:val="p"/>
+          </m:rPr>
+          <m:t>∼</m:t>
+        </m:r>
+      </m:oMath>
+      <w:r>
+        <w:t xml:space="preserve">180s every time.</w:t>
+      </w:r>
+      <w:r>
+        <w:t xml:space="preserve"> </w:t>
+      </w:r>
+      <w:r>
+        <w:rPr>
+          <w:rStyle w:val="VerbatimChar"/>
+        </w:rPr>
+        <w:t xml:space="preserve">grid_423</w:t>
+      </w:r>
+      <w:r>
+        <w:t xml:space="preserve"> </w:t>
+      </w:r>
+      <w:r>
+        <w:t xml:space="preserve">reappears in Section </w:t>
+      </w:r>
+      <w:hyperlink w:anchor="sec:speedup">
         <w:r>
           <w:rPr>
             <w:rStyle w:val="Hyperlink"/>
@@ -717,46 +1240,57 @@
         <w:t xml:space="preserve"> </w:t>
       </w:r>
       <w:r>
-        <w:t xml:space="preserve">test whether restart-portfolio search, as an architectural class, occupies a genuinely different point in the design space than partition-based search – using orca-solver as a concrete, independently developed representative of that alternative, and an unmodified naive backtracker to show the comparison is not trivial. This establishes why the mechanism is worth building at all. Section </w:t>
-      </w:r>
-      <w:hyperlink w:anchor="sec:ablation">
+        <w:t xml:space="preserve">as the grid where xfill uniquely completes what orca-solver cannot – a completion advantage this ablation shows rests on exactly the unreliable configuration: shared weights on, the default. Against Section </w:t>
+      </w:r>
+      <w:hyperlink w:anchor="sec:arch">
         <w:r>
           <w:rPr>
             <w:rStyle w:val="Hyperlink"/>
           </w:rPr>
-          <w:t xml:space="preserve">5.7</w:t>
+          <w:t xml:space="preserve">3</w:t>
         </w:r>
       </w:hyperlink>
       <w:r>
-        <w:t xml:space="preserve"> </w:t>
-      </w:r>
-      <w:r>
-        <w:t xml:space="preserve">then isolates the mechanism itself, holding architecture fixed, which is this paper’s actual contribution.</w:t>
-      </w:r>
-    </w:p>
-    <w:p>
-      <w:pPr>
-        <w:pStyle w:val="BodyText"/>
-      </w:pPr>
-      <w:r>
-        <w:rPr>
-          <w:b/>
-          <w:bCs/>
-        </w:rPr>
-        <w:t xml:space="preserve">Solvers.</w:t>
-      </w:r>
-      <w:r>
-        <w:t xml:space="preserve"> </w:t>
-      </w:r>
-      <w:r>
-        <w:t xml:space="preserve">xfill (this work); orca-solver, a partition-based parallel solver treated as a black box; ingrid_core, a single-threaded reference solver; and, as a naive baseline with no restarts, no learned heuristics, and no parallelism, crossword-composer (a static-constraint-order Rust backtracker). A second naive baseline, savin_crossword, was tested but is excluded below: it timed out on all 20 grids at both a 120s and a 300s cap, including trivial</w:t>
+        <w:t xml:space="preserve">’s broader-corpus finding of a consistent win, the synthesis is regime-dependent: shared weights help on typical grids by redistributing which crossings each worker deprioritizes, but at the extreme difficulty end they trade tight, well-behaved variance for a wider one that is not reliably better, and sometimes reliably worse. We have no evidence for a uniform win, so we do not claim one – the same standard Section </w:t>
+      </w:r>
+      <w:hyperlink w:anchor="sec:negative">
+        <w:r>
+          <w:rPr>
+            <w:rStyle w:val="Hyperlink"/>
+          </w:rPr>
+          <w:t xml:space="preserve">4</w:t>
+        </w:r>
+      </w:hyperlink>
+      <w:r>
+        <w:t xml:space="preserve"> </w:t>
+      </w:r>
+      <w:r>
+        <w:t xml:space="preserve">applies to the heuristics it rules out.</w:t>
+      </w:r>
+    </w:p>
+    <w:bookmarkEnd w:id="18"/>
+    <w:bookmarkStart w:id="23" w:name="sec:oversub"/>
+    <w:p>
+      <w:pPr>
+        <w:pStyle w:val="Heading2"/>
+      </w:pPr>
+      <w:r>
+        <w:t xml:space="preserve">Restart Portfolios Exploit Added Parallelism</w:t>
+      </w:r>
+    </w:p>
+    <w:p>
+      <w:pPr>
+        <w:pStyle w:val="FirstParagraph"/>
+      </w:pPr>
+      <w:r>
+        <w:t xml:space="preserve">Restart-portfolio search should benefit from more independent workers even past the physical core count, because heavy-tailed runtime means each additional worker is another draw that might get lucky early. We tested this directly on a known-hard</w:t>
       </w:r>
       <w:r>
         <w:t xml:space="preserve"> </w:t>
       </w:r>
       <m:oMath>
         <m:r>
-          <m:t>5</m:t>
+          <m:t>7</m:t>
         </m:r>
         <m:r>
           <m:rPr>
@@ -765,220 +1299,17 @@
           <m:t>×</m:t>
         </m:r>
         <m:r>
-          <m:t>5</m:t>
+          <m:t>7</m:t>
         </m:r>
       </m:oMath>
       <w:r>
-        <w:t xml:space="preserve">/</w:t>
-      </w:r>
-      <m:oMath>
-        <m:r>
-          <m:t>7</m:t>
-        </m:r>
-        <m:r>
-          <m:rPr>
-            <m:sty m:val="p"/>
-          </m:rPr>
-          <m:t>×</m:t>
-        </m:r>
-        <m:r>
-          <m:t>7</m:t>
-        </m:r>
-      </m:oMath>
-      <w:r>
-        <w:t xml:space="preserve"> </w:t>
-      </w:r>
-      <w:r>
-        <w:t xml:space="preserve">ones (Section </w:t>
-      </w:r>
-      <w:hyperlink w:anchor="sec:naive">
-        <w:r>
-          <w:rPr>
-            <w:rStyle w:val="Hyperlink"/>
-          </w:rPr>
-          <w:t xml:space="preserve">5.4</w:t>
-        </w:r>
-      </w:hyperlink>
-      <w:r>
-        <w:t xml:space="preserve">). The remaining four run through a single fixed harness (</w:t>
-      </w:r>
-      <w:r>
-        <w:rPr>
-          <w:rStyle w:val="VerbatimChar"/>
-        </w:rPr>
-        <w:t xml:space="preserve">benchmarks/urtc2026_testbench/</w:t>
-      </w:r>
-      <w:r>
-        <w:t xml:space="preserve">), against a dictionary derived deterministically from the repository’s own freely available word list, with a fixed seed and a 300-second cap, reproducible via</w:t>
-      </w:r>
-      <w:r>
-        <w:t xml:space="preserve"> </w:t>
-      </w:r>
-      <w:r>
-        <w:rPr>
-          <w:rStyle w:val="VerbatimChar"/>
-        </w:rPr>
-        <w:t xml:space="preserve">run_benchmark.py</w:t>
-      </w:r>
-      <w:r>
-        <w:t xml:space="preserve">; every timeout was re-tested at 600s via</w:t>
-      </w:r>
-      <w:r>
-        <w:t xml:space="preserve"> </w:t>
-      </w:r>
-      <w:r>
-        <w:rPr>
-          <w:rStyle w:val="VerbatimChar"/>
-        </w:rPr>
-        <w:t xml:space="preserve">rerun_timeouts.py</w:t>
-      </w:r>
-      <w:r>
-        <w:t xml:space="preserve"> </w:t>
-      </w:r>
-      <w:r>
-        <w:t xml:space="preserve">to rule out an under-provisioned cap (Section </w:t>
-      </w:r>
-      <w:hyperlink w:anchor="sec:naive">
-        <w:r>
-          <w:rPr>
-            <w:rStyle w:val="Hyperlink"/>
-          </w:rPr>
-          <w:t xml:space="preserve">5.4</w:t>
-        </w:r>
-      </w:hyperlink>
-      <w:r>
-        <w:t xml:space="preserve">). xfill and orca-solver race independent workers, so wall time varies run to run; each runs 5 times per grid, median reported, every trial logged. ingrid_core and crossword-composer are single-threaded and deterministic, so each runs once.</w:t>
-      </w:r>
-    </w:p>
-    <w:p>
-      <w:pPr>
-        <w:pStyle w:val="BodyText"/>
-      </w:pPr>
-      <w:r>
-        <w:rPr>
-          <w:b/>
-          <w:bCs/>
-        </w:rPr>
-        <w:t xml:space="preserve">Grid set.</w:t>
-      </w:r>
-      <w:r>
-        <w:t xml:space="preserve"> </w:t>
-      </w:r>
-      <w:r>
-        <w:t xml:space="preserve">A size-graded curated set (</w:t>
-      </w:r>
-      <m:oMath>
-        <m:r>
-          <m:t>5</m:t>
-        </m:r>
-        <m:r>
-          <m:rPr>
-            <m:sty m:val="p"/>
-          </m:rPr>
-          <m:t>×</m:t>
-        </m:r>
-        <m:r>
-          <m:t>5</m:t>
-        </m:r>
-      </m:oMath>
-      <w:r>
-        <w:t xml:space="preserve"> </w:t>
-      </w:r>
-      <w:r>
-        <w:t xml:space="preserve">through</w:t>
-      </w:r>
-      <w:r>
-        <w:t xml:space="preserve"> </w:t>
-      </w:r>
-      <m:oMath>
-        <m:r>
-          <m:t>21</m:t>
-        </m:r>
-        <m:r>
-          <m:rPr>
-            <m:sty m:val="p"/>
-          </m:rPr>
-          <m:t>×</m:t>
-        </m:r>
-        <m:r>
-          <m:t>21</m:t>
-        </m:r>
-      </m:oMath>
-      <w:r>
-        <w:t xml:space="preserve">) plus a fixed-seed random sample of</w:t>
-      </w:r>
-      <w:r>
-        <w:t xml:space="preserve"> </w:t>
-      </w:r>
-      <m:oMath>
-        <m:r>
-          <m:t>15</m:t>
-        </m:r>
-        <m:r>
-          <m:rPr>
-            <m:sty m:val="p"/>
-          </m:rPr>
-          <m:t>×</m:t>
-        </m:r>
-        <m:r>
-          <m:t>15</m:t>
-        </m:r>
-      </m:oMath>
-      <w:r>
-        <w:t xml:space="preserve"> </w:t>
-      </w:r>
-      <w:r>
-        <w:t xml:space="preserve">grids scraped from a public corpus of real, previously published crossword layouts, crosswordgrids.com</w:t>
-      </w:r>
-      <w:r>
-        <w:t xml:space="preserve"> </w:t>
-      </w:r>
-      <w:r>
-        <w:t xml:space="preserve">, all committed to the repository.</w:t>
-      </w:r>
-    </w:p>
-    <w:bookmarkEnd w:id="13"/>
-    <w:bookmarkStart w:id="18" w:name="sec:oversub"/>
-    <w:p>
-      <w:pPr>
-        <w:pStyle w:val="Heading2"/>
-      </w:pPr>
-      <w:r>
-        <w:t xml:space="preserve">Restart Portfolios Exploit Added Parallelism</w:t>
-      </w:r>
-    </w:p>
-    <w:p>
-      <w:pPr>
-        <w:pStyle w:val="FirstParagraph"/>
-      </w:pPr>
-      <w:r>
-        <w:t xml:space="preserve">Restart-portfolio search should benefit from more independent workers even past the physical core count, because heavy-tailed runtime means each additional worker is another draw that might get lucky early. We tested this directly on a known-hard</w:t>
-      </w:r>
-      <w:r>
-        <w:t xml:space="preserve"> </w:t>
-      </w:r>
-      <m:oMath>
-        <m:r>
-          <m:t>7</m:t>
-        </m:r>
-        <m:r>
-          <m:rPr>
-            <m:sty m:val="p"/>
-          </m:rPr>
-          <m:t>×</m:t>
-        </m:r>
-        <m:r>
-          <m:t>7</m:t>
-        </m:r>
-      </m:oMath>
-      <w:r>
         <w:t xml:space="preserve"> </w:t>
       </w:r>
       <w:r>
         <w:t xml:space="preserve">grid (two pre-filled letters, no blocked cells, single sample), oversubscribing threads well past this machine’s 14 physical cores: wall time falls from 166.7s at 1 thread to 63.0s at 14, then wanders (104.6s at 28, 85.6s at 42, 112.4s at 56) as contention erodes further gains. Every configuration beats the 201.7s single-threaded baseline an independently developed partition-based solver publishes on the same grid – an external difficulty anchor, not a target being chased.</w:t>
       </w:r>
     </w:p>
-    <w:bookmarkStart w:id="17" w:name="fig:scaling"/>
+    <w:bookmarkStart w:id="22" w:name="fig:scaling"/>
     <w:p>
       <w:pPr>
         <w:pStyle w:val="CaptionedFigure"/>
@@ -988,18 +1319,18 @@
           <wp:inline>
             <wp:extent cx="5334000" cy="2327144"/>
             <wp:effectExtent b="0" l="0" r="0" t="0"/>
-            <wp:docPr descr="" title="" id="15" name="Picture"/>
+            <wp:docPr descr="" title="" id="20" name="Picture"/>
             <a:graphic>
               <a:graphicData uri="http://schemas.openxmlformats.org/drawingml/2006/picture">
                 <pic:pic>
                   <pic:nvPicPr>
-                    <pic:cNvPr descr="../benchmarks/urtc2026_testbench/results/figures/fig5_thread_scaling.pdf" id="16" name="Picture"/>
+                    <pic:cNvPr descr="../benchmarks/urtc2026_testbench/results/figures/fig5_thread_scaling.pdf" id="21" name="Picture"/>
                     <pic:cNvPicPr>
                       <a:picLocks noChangeArrowheads="1" noChangeAspect="1"/>
                     </pic:cNvPicPr>
                   </pic:nvPicPr>
                   <pic:blipFill>
-                    <a:blip r:embed="rId14"/>
+                    <a:blip r:embed="rId19"/>
                     <a:stretch>
                       <a:fillRect/>
                     </a:stretch>
@@ -1054,9 +1385,9 @@
         <w:t xml:space="preserve">from 1 to 42 threads while orca-solver stays flat and cannot solve at all below 14.</w:t>
       </w:r>
     </w:p>
-    <w:bookmarkEnd w:id="17"/>
-    <w:bookmarkEnd w:id="18"/>
-    <w:bookmarkStart w:id="23" w:name="sec:scaling"/>
+    <w:bookmarkEnd w:id="22"/>
+    <w:bookmarkEnd w:id="23"/>
+    <w:bookmarkStart w:id="28" w:name="sec:scaling"/>
     <w:p>
       <w:pPr>
         <w:pStyle w:val="Heading2"/>
@@ -1077,7 +1408,7 @@
           <w:rPr>
             <w:rStyle w:val="Hyperlink"/>
           </w:rPr>
-          <w:t xml:space="preserve">1</w:t>
+          <w:t xml:space="preserve">2</w:t>
         </w:r>
       </w:hyperlink>
       <w:r>
@@ -1091,7 +1422,7 @@
           <w:rPr>
             <w:rStyle w:val="Hyperlink"/>
           </w:rPr>
-          <w:t xml:space="preserve">5.2</w:t>
+          <w:t xml:space="preserve">5.3</w:t>
         </w:r>
       </w:hyperlink>
       <w:r>
@@ -1170,7 +1501,7 @@
         <w:t xml:space="preserve">, neither solver succeeds at any thread count – this one favors neither architecture. Where the pattern does hold, it holds because absorbing extra parallelism without restructuring the search is what a non-partitioning restart portfolio is built to do; a partition-based design here does not exhibit that capacity to nearly the same degree.</w:t>
       </w:r>
     </w:p>
-    <w:bookmarkStart w:id="22" w:name="fig:size"/>
+    <w:bookmarkStart w:id="27" w:name="fig:size"/>
     <w:p>
       <w:pPr>
         <w:pStyle w:val="CaptionedFigure"/>
@@ -1180,18 +1511,18 @@
           <wp:inline>
             <wp:extent cx="5334000" cy="2631907"/>
             <wp:effectExtent b="0" l="0" r="0" t="0"/>
-            <wp:docPr descr="" title="" id="20" name="Picture"/>
+            <wp:docPr descr="" title="" id="25" name="Picture"/>
             <a:graphic>
               <a:graphicData uri="http://schemas.openxmlformats.org/drawingml/2006/picture">
                 <pic:pic>
                   <pic:nvPicPr>
-                    <pic:cNvPr descr="../benchmarks/urtc2026_testbench/results/figures/fig1_success_by_size.pdf" id="21" name="Picture"/>
+                    <pic:cNvPr descr="../benchmarks/urtc2026_testbench/results/figures/fig1_success_by_size.pdf" id="26" name="Picture"/>
                     <pic:cNvPicPr>
                       <a:picLocks noChangeArrowheads="1" noChangeAspect="1"/>
                     </pic:cNvPicPr>
                   </pic:nvPicPr>
                   <pic:blipFill>
-                    <a:blip r:embed="rId19"/>
+                    <a:blip r:embed="rId24"/>
                     <a:stretch>
                       <a:fillRect/>
                     </a:stretch>
@@ -1223,7 +1554,7 @@
         <w:pStyle w:val="ImageCaption"/>
       </w:pPr>
       <w:r>
-        <w:t xml:space="preserve">Time to solve or prove UNSAT by grid size, curated set, 600s cap (log scale; open triangle = timed out). A solved/not-solved view of this same data would show xfill, orca-solver, and ingrid_core essentially tied, since all three succeed on the same grids here – the actual difference is that xfill’s line sits one to three orders of magnitude below the others at every size except</w:t>
+        <w:t xml:space="preserve">Time to solve or prove UNSAT by grid size, curated set, 1000s cap (log scale; open triangle = timed out). A solved/not-solved view of this same data would show xfill, orca-solver, and ingrid_core essentially tied, since all three succeed on the same grids here – the actual difference is that xfill’s line sits one to three orders of magnitude below the others at every size except</w:t>
       </w:r>
       <w:r>
         <w:t xml:space="preserve"> </w:t>
@@ -1272,9 +1603,9 @@
         <w:t xml:space="preserve">(an easy UNSAT proof every solver resolves in well under a second regardless).</w:t>
       </w:r>
     </w:p>
-    <w:bookmarkEnd w:id="22"/>
-    <w:bookmarkEnd w:id="23"/>
-    <w:bookmarkStart w:id="28" w:name="sec:naive"/>
+    <w:bookmarkEnd w:id="27"/>
+    <w:bookmarkEnd w:id="28"/>
+    <w:bookmarkStart w:id="33" w:name="sec:naive"/>
     <w:p>
       <w:pPr>
         <w:pStyle w:val="Heading2"/>
@@ -1288,119 +1619,7 @@
         <w:pStyle w:val="FirstParagraph"/>
       </w:pPr>
       <w:r>
-        <w:t xml:space="preserve">Across all 20 grids, xfill resolved 19 (18 solved, 1 UNSAT; 1 timeout), orca-solver 18 (17 solved, 1 UNSAT; 2 timeouts), ingrid_core 17 (16 solved, 1 UNSAT; 3 timeouts), and crossword-composer 9 (8 solved, 1 UNSAT; 11 timeouts); savin_crossword resolved</w:t>
-      </w:r>
-      <w:r>
-        <w:t xml:space="preserve"> </w:t>
-      </w:r>
-      <w:r>
-        <w:rPr>
-          <w:i/>
-          <w:iCs/>
-        </w:rPr>
-        <w:t xml:space="preserve">none</w:t>
-      </w:r>
-      <w:r>
-        <w:t xml:space="preserve">, for the reasons given in Setup, and never appears in Fig. </w:t>
-      </w:r>
-      <w:hyperlink w:anchor="fig:size">
-        <w:r>
-          <w:rPr>
-            <w:rStyle w:val="Hyperlink"/>
-          </w:rPr>
-          <w:t xml:space="preserve">2</w:t>
-        </w:r>
-      </w:hyperlink>
-      <w:r>
-        <w:t xml:space="preserve"> </w:t>
-      </w:r>
-      <w:r>
-        <w:t xml:space="preserve">or Fig. </w:t>
-      </w:r>
-      <w:hyperlink w:anchor="fig:speedup">
-        <w:r>
-          <w:rPr>
-            <w:rStyle w:val="Hyperlink"/>
-          </w:rPr>
-          <w:t xml:space="preserve">3</w:t>
-        </w:r>
-      </w:hyperlink>
-      <w:r>
-        <w:t xml:space="preserve">. Its failure differs in kind from crossword-composer’s: crossword-composer solves most grids and fails only on individual instances, unrelated to dictionary size, while savin_crossword’s least-constraining-value step recomputes an</w:t>
-      </w:r>
-      <w:r>
-        <w:t xml:space="preserve"> </w:t>
-      </w:r>
-      <m:oMath>
-        <m:r>
-          <m:t>O</m:t>
-        </m:r>
-        <m:r>
-          <m:rPr>
-            <m:sty m:val="p"/>
-          </m:rPr>
-          <m:t>(</m:t>
-        </m:r>
-        <m:r>
-          <m:rPr>
-            <m:sty m:val="p"/>
-          </m:rPr>
-          <m:t>|</m:t>
-        </m:r>
-        <m:r>
-          <m:rPr>
-            <m:nor/>
-            <m:sty m:val="p"/>
-          </m:rPr>
-          <m:t>domain</m:t>
-        </m:r>
-        <m:sSup>
-          <m:e>
-            <m:r>
-              <m:rPr>
-                <m:sty m:val="p"/>
-              </m:rPr>
-              <m:t>|</m:t>
-            </m:r>
-          </m:e>
-          <m:sup>
-            <m:r>
-              <m:t>2</m:t>
-            </m:r>
-          </m:sup>
-        </m:sSup>
-        <m:r>
-          <m:rPr>
-            <m:sty m:val="p"/>
-          </m:rPr>
-          <m:t>)</m:t>
-        </m:r>
-      </m:oMath>
-      <w:r>
-        <w:t xml:space="preserve"> </w:t>
-      </w:r>
-      <w:r>
-        <w:t xml:space="preserve">score from scratch at every node, which our</w:t>
-      </w:r>
-      <w:r>
-        <w:t xml:space="preserve"> </w:t>
-      </w:r>
-      <m:oMath>
-        <m:r>
-          <m:rPr>
-            <m:sty m:val="p"/>
-          </m:rPr>
-          <m:t>∼</m:t>
-        </m:r>
-      </m:oMath>
-      <w:r>
-        <w:t xml:space="preserve">184</w:t>
-      </w:r>
-      <w:r>
-        <w:t xml:space="preserve">,</w:t>
-      </w:r>
-      <w:r>
-        <w:t xml:space="preserve">000-word dictionary makes prohibitive regardless of size – both real, unmodified, independently authored solvers, tested rather than assumed to fail. Doubling the cap to 600s changed exactly one outcome: ingrid_core went on to solve</w:t>
+        <w:t xml:space="preserve">Across all 20 grids, xfill resolved 19 (18 solved, 1 UNSAT; 1 timeout), orca-solver 18 (17 solved, 1 UNSAT; 2 timeouts), ingrid_core 17 (16 solved, 1 UNSAT; 3 timeouts), and crossword-composer 9 (8 solved, 1 UNSAT; 11 timeouts) – a real, unmodified, independently authored solver, not a strawman built to lose. Escalating the cap from 300s to 600s changed exactly one outcome: ingrid_core went on to solve</w:t>
       </w:r>
       <w:r>
         <w:t xml:space="preserve"> </w:t>
@@ -1415,7 +1634,7 @@
         <w:t xml:space="preserve"> </w:t>
       </w:r>
       <w:r>
-        <w:t xml:space="preserve">in 325s. Every other timeout – all 11 of crossword-composer’s, plus</w:t>
+        <w:t xml:space="preserve">in 325s. A further escalation to 1000s – the cap these figures use – changed none: every remaining timeout, all 11 of crossword-composer’s plus</w:t>
       </w:r>
       <w:r>
         <w:t xml:space="preserve"> </w:t>
@@ -1427,7 +1646,7 @@
         <w:t xml:space="preserve">sample_13x13</w:t>
       </w:r>
       <w:r>
-        <w:t xml:space="preserve">, the one grid no solver resolves at either cap – held: evidence these are hard, not under-budgeted. The point for this paper’s thesis is narrower than</w:t>
+        <w:t xml:space="preserve">, the one grid no solver resolves at any cap tested, held again: evidence these are hard, not under-budgeted. The point for this paper’s thesis is narrower than</w:t>
       </w:r>
       <w:r>
         <w:t xml:space="preserve"> </w:t>
@@ -1439,7 +1658,7 @@
         <w:t xml:space="preserve">: at the grid and dictionary sizes crossword filling actually requires, restarts, adaptive heuristics, and parallelism are not optional refinements – they are the premise on which the rest of this section, and the mechanism this paper contributes, depend.</w:t>
       </w:r>
     </w:p>
-    <w:bookmarkStart w:id="27" w:name="fig:speedup"/>
+    <w:bookmarkStart w:id="32" w:name="fig:speedup"/>
     <w:p>
       <w:pPr>
         <w:pStyle w:val="CaptionedFigure"/>
@@ -1447,20 +1666,20 @@
       <w:r>
         <w:drawing>
           <wp:inline>
-            <wp:extent cx="4907280" cy="1770849"/>
+            <wp:extent cx="4907280" cy="1823710"/>
             <wp:effectExtent b="0" l="0" r="0" t="0"/>
-            <wp:docPr descr="" title="" id="25" name="Picture"/>
+            <wp:docPr descr="" title="" id="30" name="Picture"/>
             <a:graphic>
               <a:graphicData uri="http://schemas.openxmlformats.org/drawingml/2006/picture">
                 <pic:pic>
                   <pic:nvPicPr>
-                    <pic:cNvPr descr="../benchmarks/urtc2026_testbench/results/figures/fig1b_speedup.pdf" id="26" name="Picture"/>
+                    <pic:cNvPr descr="../benchmarks/urtc2026_testbench/results/figures/fig1b_speedup.pdf" id="31" name="Picture"/>
                     <pic:cNvPicPr>
                       <a:picLocks noChangeArrowheads="1" noChangeAspect="1"/>
                     </pic:cNvPicPr>
                   </pic:nvPicPr>
                   <pic:blipFill>
-                    <a:blip r:embed="rId24"/>
+                    <a:blip r:embed="rId29"/>
                     <a:stretch>
                       <a:fillRect/>
                     </a:stretch>
@@ -1468,7 +1687,7 @@
                   <pic:spPr bwMode="auto">
                     <a:xfrm>
                       <a:off x="0" y="0"/>
-                      <a:ext cx="4907280" cy="1770849"/>
+                      <a:ext cx="4907280" cy="1823710"/>
                     </a:xfrm>
                     <a:prstGeom prst="rect">
                       <a:avLst/>
@@ -1492,7 +1711,7 @@
         <w:pStyle w:val="ImageCaption"/>
       </w:pPr>
       <w:r>
-        <w:t xml:space="preserve">Wall time to solve (log scale, 600s cap), four solvers, per scraped</w:t>
+        <w:t xml:space="preserve">Wall time to solve (log scale, 1000s cap), four solvers, per scraped</w:t>
       </w:r>
       <w:r>
         <w:t xml:space="preserve"> </w:t>
@@ -1518,6 +1737,237 @@
         <w:t xml:space="preserve">grid, sorted by xfill’s time. Hatched bars mark a timeout; crossword-composer times out on most grids, the same pattern reported by count in Section </w:t>
       </w:r>
       <w:hyperlink w:anchor="sec:naive">
+        <w:r>
+          <w:rPr>
+            <w:rStyle w:val="Hyperlink"/>
+          </w:rPr>
+          <w:t xml:space="preserve">5.5</w:t>
+        </w:r>
+      </w:hyperlink>
+      <w:r>
+        <w:t xml:space="preserve">. Label above the xfill/orca-solver pair is orca-solver time / xfill time; two grids (</w:t>
+      </w:r>
+      <w:r>
+        <w:rPr>
+          <w:rStyle w:val="VerbatimChar"/>
+        </w:rPr>
+        <w:t xml:space="preserve">grid_395</w:t>
+      </w:r>
+      <w:r>
+        <w:t xml:space="preserve">,</w:t>
+      </w:r>
+      <w:r>
+        <w:t xml:space="preserve"> </w:t>
+      </w:r>
+      <w:r>
+        <w:rPr>
+          <w:rStyle w:val="VerbatimChar"/>
+        </w:rPr>
+        <w:t xml:space="preserve">grid_479</w:t>
+      </w:r>
+      <w:r>
+        <w:t xml:space="preserve">) favor orca-solver, and on</w:t>
+      </w:r>
+      <w:r>
+        <w:t xml:space="preserve"> </w:t>
+      </w:r>
+      <w:r>
+        <w:rPr>
+          <w:rStyle w:val="VerbatimChar"/>
+        </w:rPr>
+        <w:t xml:space="preserve">grid_423</w:t>
+      </w:r>
+      <w:r>
+        <w:t xml:space="preserve"> </w:t>
+      </w:r>
+      <w:r>
+        <w:t xml:space="preserve">orca-solver cannot solve it even at this cap while xfill does, in 270s.</w:t>
+      </w:r>
+    </w:p>
+    <w:bookmarkEnd w:id="32"/>
+    <w:bookmarkEnd w:id="33"/>
+    <w:bookmarkStart w:id="34" w:name="sec:speedup"/>
+    <w:p>
+      <w:pPr>
+        <w:pStyle w:val="Heading2"/>
+      </w:pPr>
+      <w:r>
+        <w:t xml:space="preserve">Aggregate Speed Advantage Where Both Solve</w:t>
+      </w:r>
+    </w:p>
+    <w:p>
+      <w:pPr>
+        <w:pStyle w:val="FirstParagraph"/>
+      </w:pPr>
+      <w:r>
+        <w:t xml:space="preserve">Fig. </w:t>
+      </w:r>
+      <w:hyperlink w:anchor="fig:speedup">
+        <w:r>
+          <w:rPr>
+            <w:rStyle w:val="Hyperlink"/>
+          </w:rPr>
+          <w:t xml:space="preserve">4</w:t>
+        </w:r>
+      </w:hyperlink>
+      <w:r>
+        <w:t xml:space="preserve"> </w:t>
+      </w:r>
+      <w:r>
+        <w:t xml:space="preserve">quantifies the restart-portfolio/partition comparison on the scraped</w:t>
+      </w:r>
+      <w:r>
+        <w:t xml:space="preserve"> </w:t>
+      </w:r>
+      <m:oMath>
+        <m:r>
+          <m:t>15</m:t>
+        </m:r>
+        <m:r>
+          <m:rPr>
+            <m:sty m:val="p"/>
+          </m:rPr>
+          <m:t>×</m:t>
+        </m:r>
+        <m:r>
+          <m:t>15</m:t>
+        </m:r>
+      </m:oMath>
+      <w:r>
+        <w:t xml:space="preserve"> </w:t>
+      </w:r>
+      <w:r>
+        <w:t xml:space="preserve">corpus alone</w:t>
+      </w:r>
+      <w:r>
+        <w:t xml:space="preserve"> </w:t>
+      </w:r>
+      <w:r>
+        <w:t xml:space="preserve"> </w:t>
+      </w:r>
+      <w:r>
+        <w:t xml:space="preserve">– realistic-scale grids, rather than the curated size-graded set, which mixes in small grids that inflate the ratio. Of the 11 scraped grids (of 12) both xfill and orca-solver solve, xfill is faster on 9, with a median speedup of</w:t>
+      </w:r>
+      <w:r>
+        <w:t xml:space="preserve"> </w:t>
+      </w:r>
+      <m:oMath>
+        <m:r>
+          <m:t>494</m:t>
+        </m:r>
+        <m:r>
+          <m:rPr>
+            <m:sty m:val="p"/>
+          </m:rPr>
+          <m:t>×</m:t>
+        </m:r>
+      </m:oMath>
+      <w:r>
+        <w:t xml:space="preserve"> </w:t>
+      </w:r>
+      <w:r>
+        <w:t xml:space="preserve">and a geometric mean of</w:t>
+      </w:r>
+      <w:r>
+        <w:t xml:space="preserve"> </w:t>
+      </w:r>
+      <m:oMath>
+        <m:r>
+          <m:t>107</m:t>
+        </m:r>
+        <m:r>
+          <m:rPr>
+            <m:sty m:val="p"/>
+          </m:rPr>
+          <m:t>×</m:t>
+        </m:r>
+      </m:oMath>
+      <w:r>
+        <w:t xml:space="preserve">. Two exceptions run the other way: on</w:t>
+      </w:r>
+      <w:r>
+        <w:t xml:space="preserve"> </w:t>
+      </w:r>
+      <w:r>
+        <w:rPr>
+          <w:rStyle w:val="VerbatimChar"/>
+        </w:rPr>
+        <w:t xml:space="preserve">grid_395</w:t>
+      </w:r>
+      <w:r>
+        <w:t xml:space="preserve"> </w:t>
+      </w:r>
+      <w:r>
+        <w:t xml:space="preserve">and</w:t>
+      </w:r>
+      <w:r>
+        <w:t xml:space="preserve"> </w:t>
+      </w:r>
+      <w:r>
+        <w:rPr>
+          <w:rStyle w:val="VerbatimChar"/>
+        </w:rPr>
+        <w:t xml:space="preserve">grid_479</w:t>
+      </w:r>
+      <w:r>
+        <w:t xml:space="preserve">, orca-solver is faster, by</w:t>
+      </w:r>
+      <w:r>
+        <w:t xml:space="preserve"> </w:t>
+      </w:r>
+      <m:oMath>
+        <m:r>
+          <m:t>5.4</m:t>
+        </m:r>
+        <m:r>
+          <m:rPr>
+            <m:sty m:val="p"/>
+          </m:rPr>
+          <m:t>×</m:t>
+        </m:r>
+      </m:oMath>
+      <w:r>
+        <w:t xml:space="preserve"> </w:t>
+      </w:r>
+      <w:r>
+        <w:t xml:space="preserve">and</w:t>
+      </w:r>
+      <w:r>
+        <w:t xml:space="preserve"> </w:t>
+      </w:r>
+      <m:oMath>
+        <m:r>
+          <m:t>1.6</m:t>
+        </m:r>
+        <m:r>
+          <m:rPr>
+            <m:sty m:val="p"/>
+          </m:rPr>
+          <m:t>×</m:t>
+        </m:r>
+      </m:oMath>
+      <w:r>
+        <w:t xml:space="preserve"> </w:t>
+      </w:r>
+      <w:r>
+        <w:t xml:space="preserve">– consistent with</w:t>
+      </w:r>
+      <w:r>
+        <w:t xml:space="preserve"> </w:t>
+      </w:r>
+      <w:r>
+        <w:rPr>
+          <w:rStyle w:val="VerbatimChar"/>
+        </w:rPr>
+        <w:t xml:space="preserve">grid_115</w:t>
+      </w:r>
+      <w:r>
+        <w:t xml:space="preserve"> </w:t>
+      </w:r>
+      <w:r>
+        <w:t xml:space="preserve">in Section </w:t>
+      </w:r>
+      <w:hyperlink w:anchor="sec:scaling">
         <w:r>
           <w:rPr>
             <w:rStyle w:val="Hyperlink"/>
@@ -1526,12 +1976,47 @@
         </w:r>
       </w:hyperlink>
       <w:r>
-        <w:t xml:space="preserve"> </w:t>
-      </w:r>
-      <w:r>
-        <w:t xml:space="preserve">(savin_crossword is excluded entirely, also Section </w:t>
-      </w:r>
-      <w:hyperlink w:anchor="sec:naive">
+        <w:t xml:space="preserve">, not every grid favors either architecture.</w:t>
+      </w:r>
+      <w:r>
+        <w:t xml:space="preserve"> </w:t>
+      </w:r>
+      <w:r>
+        <w:rPr>
+          <w:rStyle w:val="VerbatimChar"/>
+        </w:rPr>
+        <w:t xml:space="preserve">grid_423</w:t>
+      </w:r>
+      <w:r>
+        <w:t xml:space="preserve">, the twelfth scraped grid, sharpens this in the opposite direction: xfill solves it in 270s where orca-solver cannot, even at this paper’s full 1000s cap – a completion advantage, not just a speed one (revisited in Section </w:t>
+      </w:r>
+      <w:hyperlink w:anchor="sec:ablation">
+        <w:r>
+          <w:rPr>
+            <w:rStyle w:val="Hyperlink"/>
+          </w:rPr>
+          <w:t xml:space="preserve">5.2</w:t>
+        </w:r>
+      </w:hyperlink>
+      <w:r>
+        <w:t xml:space="preserve">). Across the full 20-grid sample, xfill resolves 19, orca-solver 18, both agree on the sample’s one correct UNSAT proof, and both are stuck only on</w:t>
+      </w:r>
+      <w:r>
+        <w:t xml:space="preserve"> </w:t>
+      </w:r>
+      <w:r>
+        <w:rPr>
+          <w:rStyle w:val="VerbatimChar"/>
+        </w:rPr>
+        <w:t xml:space="preserve">sample_13x13</w:t>
+      </w:r>
+      <w:r>
+        <w:t xml:space="preserve"> </w:t>
+      </w:r>
+      <w:r>
+        <w:t xml:space="preserve">– a narrower gap on success alone than on speed, which is why Sections </w:t>
+      </w:r>
+      <w:hyperlink w:anchor="sec:scaling">
         <w:r>
           <w:rPr>
             <w:rStyle w:val="Hyperlink"/>
@@ -1540,275 +2025,6 @@
         </w:r>
       </w:hyperlink>
       <w:r>
-        <w:t xml:space="preserve">). Label above the xfill/orca-solver pair is orca-solver time / xfill time; two grids (</w:t>
-      </w:r>
-      <w:r>
-        <w:rPr>
-          <w:rStyle w:val="VerbatimChar"/>
-        </w:rPr>
-        <w:t xml:space="preserve">grid_395</w:t>
-      </w:r>
-      <w:r>
-        <w:t xml:space="preserve">,</w:t>
-      </w:r>
-      <w:r>
-        <w:t xml:space="preserve"> </w:t>
-      </w:r>
-      <w:r>
-        <w:rPr>
-          <w:rStyle w:val="VerbatimChar"/>
-        </w:rPr>
-        <w:t xml:space="preserve">grid_479</w:t>
-      </w:r>
-      <w:r>
-        <w:t xml:space="preserve">) favor orca-solver, and on</w:t>
-      </w:r>
-      <w:r>
-        <w:t xml:space="preserve"> </w:t>
-      </w:r>
-      <w:r>
-        <w:rPr>
-          <w:rStyle w:val="VerbatimChar"/>
-        </w:rPr>
-        <w:t xml:space="preserve">grid_423</w:t>
-      </w:r>
-      <w:r>
-        <w:t xml:space="preserve"> </w:t>
-      </w:r>
-      <w:r>
-        <w:t xml:space="preserve">orca-solver cannot solve it even at this cap while xfill does, in 270s.</w:t>
-      </w:r>
-    </w:p>
-    <w:bookmarkEnd w:id="27"/>
-    <w:bookmarkEnd w:id="28"/>
-    <w:bookmarkStart w:id="29" w:name="sec:speedup"/>
-    <w:p>
-      <w:pPr>
-        <w:pStyle w:val="Heading2"/>
-      </w:pPr>
-      <w:r>
-        <w:t xml:space="preserve">Aggregate Speed Advantage Where Both Solve</w:t>
-      </w:r>
-    </w:p>
-    <w:p>
-      <w:pPr>
-        <w:pStyle w:val="FirstParagraph"/>
-      </w:pPr>
-      <w:r>
-        <w:t xml:space="preserve">Fig. </w:t>
-      </w:r>
-      <w:hyperlink w:anchor="fig:speedup">
-        <w:r>
-          <w:rPr>
-            <w:rStyle w:val="Hyperlink"/>
-          </w:rPr>
-          <w:t xml:space="preserve">3</w:t>
-        </w:r>
-      </w:hyperlink>
-      <w:r>
-        <w:t xml:space="preserve"> </w:t>
-      </w:r>
-      <w:r>
-        <w:t xml:space="preserve">quantifies the restart-portfolio/partition comparison on the scraped</w:t>
-      </w:r>
-      <w:r>
-        <w:t xml:space="preserve"> </w:t>
-      </w:r>
-      <m:oMath>
-        <m:r>
-          <m:t>15</m:t>
-        </m:r>
-        <m:r>
-          <m:rPr>
-            <m:sty m:val="p"/>
-          </m:rPr>
-          <m:t>×</m:t>
-        </m:r>
-        <m:r>
-          <m:t>15</m:t>
-        </m:r>
-      </m:oMath>
-      <w:r>
-        <w:t xml:space="preserve"> </w:t>
-      </w:r>
-      <w:r>
-        <w:t xml:space="preserve">corpus alone</w:t>
-      </w:r>
-      <w:r>
-        <w:t xml:space="preserve"> </w:t>
-      </w:r>
-      <w:r>
-        <w:t xml:space="preserve"> </w:t>
-      </w:r>
-      <w:r>
-        <w:t xml:space="preserve">– realistic-scale grids, rather than the curated size-graded set, which mixes in small grids that inflate the ratio. Of the 11 scraped grids (of 12) both xfill and orca-solver solve, xfill is faster on 9, with a median speedup of</w:t>
-      </w:r>
-      <w:r>
-        <w:t xml:space="preserve"> </w:t>
-      </w:r>
-      <m:oMath>
-        <m:r>
-          <m:t>494</m:t>
-        </m:r>
-        <m:r>
-          <m:rPr>
-            <m:sty m:val="p"/>
-          </m:rPr>
-          <m:t>×</m:t>
-        </m:r>
-      </m:oMath>
-      <w:r>
-        <w:t xml:space="preserve"> </w:t>
-      </w:r>
-      <w:r>
-        <w:t xml:space="preserve">and a geometric mean of</w:t>
-      </w:r>
-      <w:r>
-        <w:t xml:space="preserve"> </w:t>
-      </w:r>
-      <m:oMath>
-        <m:r>
-          <m:t>107</m:t>
-        </m:r>
-        <m:r>
-          <m:rPr>
-            <m:sty m:val="p"/>
-          </m:rPr>
-          <m:t>×</m:t>
-        </m:r>
-      </m:oMath>
-      <w:r>
-        <w:t xml:space="preserve">. Two exceptions run the other way: on</w:t>
-      </w:r>
-      <w:r>
-        <w:t xml:space="preserve"> </w:t>
-      </w:r>
-      <w:r>
-        <w:rPr>
-          <w:rStyle w:val="VerbatimChar"/>
-        </w:rPr>
-        <w:t xml:space="preserve">grid_395</w:t>
-      </w:r>
-      <w:r>
-        <w:t xml:space="preserve"> </w:t>
-      </w:r>
-      <w:r>
-        <w:t xml:space="preserve">and</w:t>
-      </w:r>
-      <w:r>
-        <w:t xml:space="preserve"> </w:t>
-      </w:r>
-      <w:r>
-        <w:rPr>
-          <w:rStyle w:val="VerbatimChar"/>
-        </w:rPr>
-        <w:t xml:space="preserve">grid_479</w:t>
-      </w:r>
-      <w:r>
-        <w:t xml:space="preserve">, orca-solver is faster, by</w:t>
-      </w:r>
-      <w:r>
-        <w:t xml:space="preserve"> </w:t>
-      </w:r>
-      <m:oMath>
-        <m:r>
-          <m:t>5.4</m:t>
-        </m:r>
-        <m:r>
-          <m:rPr>
-            <m:sty m:val="p"/>
-          </m:rPr>
-          <m:t>×</m:t>
-        </m:r>
-      </m:oMath>
-      <w:r>
-        <w:t xml:space="preserve"> </w:t>
-      </w:r>
-      <w:r>
-        <w:t xml:space="preserve">and</w:t>
-      </w:r>
-      <w:r>
-        <w:t xml:space="preserve"> </w:t>
-      </w:r>
-      <m:oMath>
-        <m:r>
-          <m:t>1.6</m:t>
-        </m:r>
-        <m:r>
-          <m:rPr>
-            <m:sty m:val="p"/>
-          </m:rPr>
-          <m:t>×</m:t>
-        </m:r>
-      </m:oMath>
-      <w:r>
-        <w:t xml:space="preserve"> </w:t>
-      </w:r>
-      <w:r>
-        <w:t xml:space="preserve">– consistent with</w:t>
-      </w:r>
-      <w:r>
-        <w:t xml:space="preserve"> </w:t>
-      </w:r>
-      <w:r>
-        <w:rPr>
-          <w:rStyle w:val="VerbatimChar"/>
-        </w:rPr>
-        <w:t xml:space="preserve">grid_115</w:t>
-      </w:r>
-      <w:r>
-        <w:t xml:space="preserve"> </w:t>
-      </w:r>
-      <w:r>
-        <w:t xml:space="preserve">in Section </w:t>
-      </w:r>
-      <w:hyperlink w:anchor="sec:scaling">
-        <w:r>
-          <w:rPr>
-            <w:rStyle w:val="Hyperlink"/>
-          </w:rPr>
-          <w:t xml:space="preserve">5.3</w:t>
-        </w:r>
-      </w:hyperlink>
-      <w:r>
-        <w:t xml:space="preserve">, not every grid favors either architecture.</w:t>
-      </w:r>
-      <w:r>
-        <w:t xml:space="preserve"> </w:t>
-      </w:r>
-      <w:r>
-        <w:rPr>
-          <w:rStyle w:val="VerbatimChar"/>
-        </w:rPr>
-        <w:t xml:space="preserve">grid_423</w:t>
-      </w:r>
-      <w:r>
-        <w:t xml:space="preserve">, the twelfth scraped grid, sharpens this in the opposite direction: xfill solves it in 270s where orca-solver cannot, even given double the budget – a completion advantage, not just a speed one. Across the full 20-grid sample, xfill resolves 19, orca-solver 18, both agree on the sample’s one correct UNSAT proof, and both are stuck only on</w:t>
-      </w:r>
-      <w:r>
-        <w:t xml:space="preserve"> </w:t>
-      </w:r>
-      <w:r>
-        <w:rPr>
-          <w:rStyle w:val="VerbatimChar"/>
-        </w:rPr>
-        <w:t xml:space="preserve">sample_13x13</w:t>
-      </w:r>
-      <w:r>
-        <w:t xml:space="preserve"> </w:t>
-      </w:r>
-      <w:r>
-        <w:t xml:space="preserve">– a narrower gap on success alone than on speed, which is why Sections </w:t>
-      </w:r>
-      <w:hyperlink w:anchor="sec:scaling">
-        <w:r>
-          <w:rPr>
-            <w:rStyle w:val="Hyperlink"/>
-          </w:rPr>
-          <w:t xml:space="preserve">5.3</w:t>
-        </w:r>
-      </w:hyperlink>
-      <w:r>
         <w:t xml:space="preserve"> </w:t>
       </w:r>
       <w:r>
@@ -1819,18 +2035,18 @@
           <w:rPr>
             <w:rStyle w:val="Hyperlink"/>
           </w:rPr>
-          <w:t xml:space="preserve">5.7</w:t>
+          <w:t xml:space="preserve">5.2</w:t>
         </w:r>
       </w:hyperlink>
       <w:r>
         <w:t xml:space="preserve"> </w:t>
       </w:r>
       <w:r>
-        <w:t xml:space="preserve">use a harder, pre-existing grid list to find where the architectures actually diverge.</w:t>
-      </w:r>
-    </w:p>
-    <w:bookmarkEnd w:id="29"/>
-    <w:bookmarkStart w:id="34" w:name="sec:exhaustive"/>
+        <w:t xml:space="preserve">both turn to a harder, pre-existing grid list for a more demanding test.</w:t>
+      </w:r>
+    </w:p>
+    <w:bookmarkEnd w:id="34"/>
+    <w:bookmarkStart w:id="35" w:name="sec:exhaustive"/>
     <w:p>
       <w:pPr>
         <w:pStyle w:val="Heading2"/>
@@ -1918,62 +2134,87 @@
         <w:t xml:space="preserve">.</w:t>
       </w:r>
     </w:p>
-    <w:bookmarkStart w:id="33" w:name="fig:ablation"/>
-    <w:p>
-      <w:pPr>
-        <w:pStyle w:val="CaptionedFigure"/>
-      </w:pPr>
-      <w:r>
-        <w:drawing>
-          <wp:inline>
-            <wp:extent cx="5067300" cy="1203483"/>
-            <wp:effectExtent b="0" l="0" r="0" t="0"/>
-            <wp:docPr descr="" title="" id="31" name="Picture"/>
-            <a:graphic>
-              <a:graphicData uri="http://schemas.openxmlformats.org/drawingml/2006/picture">
-                <pic:pic>
-                  <pic:nvPicPr>
-                    <pic:cNvPr descr="../benchmarks/urtc2026_testbench/results/figures/fig4_ablation.pdf" id="32" name="Picture"/>
-                    <pic:cNvPicPr>
-                      <a:picLocks noChangeArrowheads="1" noChangeAspect="1"/>
-                    </pic:cNvPicPr>
-                  </pic:nvPicPr>
-                  <pic:blipFill>
-                    <a:blip r:embed="rId30"/>
-                    <a:stretch>
-                      <a:fillRect/>
-                    </a:stretch>
-                  </pic:blipFill>
-                  <pic:spPr bwMode="auto">
-                    <a:xfrm>
-                      <a:off x="0" y="0"/>
-                      <a:ext cx="5067300" cy="1203483"/>
-                    </a:xfrm>
-                    <a:prstGeom prst="rect">
-                      <a:avLst/>
-                    </a:prstGeom>
-                    <a:noFill/>
-                    <a:ln w="9525">
-                      <a:noFill/>
-                      <a:headEnd/>
-                      <a:tailEnd/>
-                    </a:ln>
-                  </pic:spPr>
-                </pic:pic>
-              </a:graphicData>
-            </a:graphic>
-          </wp:inline>
-        </w:drawing>
-      </w:r>
-    </w:p>
-    <w:p>
-      <w:pPr>
-        <w:pStyle w:val="ImageCaption"/>
-      </w:pPr>
-      <w:r>
-        <w:t xml:space="preserve">Shared-conflict-weight ablation, off vs. on, 14 threads: the known-hard list from Fig. </w:t>
+    <w:bookmarkEnd w:id="35"/>
+    <w:bookmarkEnd w:id="36"/>
+    <w:bookmarkStart w:id="37" w:name="discussion"/>
+    <w:p>
+      <w:pPr>
+        <w:pStyle w:val="Heading1"/>
+      </w:pPr>
+      <w:r>
+        <w:t xml:space="preserve">Discussion</w:t>
+      </w:r>
+    </w:p>
+    <w:p>
+      <w:pPr>
+        <w:pStyle w:val="FirstParagraph"/>
+      </w:pPr>
+      <w:r>
+        <w:t xml:space="preserve">The architectural comparison and the mechanism ablation share one underlying cause: restart portfolios benefit from heavy-tailed runtimes, so more independent draws raise the chance of an early lucky one, which is why oversubscribing thread count helped in Section </w:t>
+      </w:r>
+      <w:hyperlink w:anchor="sec:oversub">
+        <w:r>
+          <w:rPr>
+            <w:rStyle w:val="Hyperlink"/>
+          </w:rPr>
+          <w:t xml:space="preserve">5.3</w:t>
+        </w:r>
+      </w:hyperlink>
+      <w:r>
+        <w:t xml:space="preserve"> </w:t>
+      </w:r>
+      <w:r>
+        <w:t xml:space="preserve">and Fig. </w:t>
       </w:r>
       <w:hyperlink w:anchor="fig:scaling">
+        <w:r>
+          <w:rPr>
+            <w:rStyle w:val="Hyperlink"/>
+          </w:rPr>
+          <w:t xml:space="preserve">2</w:t>
+        </w:r>
+      </w:hyperlink>
+      <w:r>
+        <w:t xml:space="preserve">, and why</w:t>
+      </w:r>
+      <w:r>
+        <w:t xml:space="preserve"> </w:t>
+      </w:r>
+      <w:r>
+        <w:rPr>
+          <w:rStyle w:val="VerbatimChar"/>
+        </w:rPr>
+        <w:t xml:space="preserve">grid_423</w:t>
+      </w:r>
+      <w:r>
+        <w:t xml:space="preserve"> </w:t>
+      </w:r>
+      <w:r>
+        <w:t xml:space="preserve">(Fig. </w:t>
+      </w:r>
+      <w:hyperlink w:anchor="fig:speedup">
+        <w:r>
+          <w:rPr>
+            <w:rStyle w:val="Hyperlink"/>
+          </w:rPr>
+          <w:t xml:space="preserve">4</w:t>
+        </w:r>
+      </w:hyperlink>
+      <w:r>
+        <w:t xml:space="preserve">) goes further: more draws can succeed where a fixed partition cannot. Partitioned search instead gives genuine non-overlapping coverage, which is what Section </w:t>
+      </w:r>
+      <w:hyperlink w:anchor="sec:exhaustive">
+        <w:r>
+          <w:rPr>
+            <w:rStyle w:val="Hyperlink"/>
+          </w:rPr>
+          <w:t xml:space="preserve">5.7</w:t>
+        </w:r>
+      </w:hyperlink>
+      <w:r>
+        <w:t xml:space="preserve">’s proof of unsatisfiability required. The same heavy-tailedness explains Fig. </w:t>
+      </w:r>
+      <w:hyperlink w:anchor="fig:ablation">
         <w:r>
           <w:rPr>
             <w:rStyle w:val="Hyperlink"/>
@@ -1982,41 +2223,17 @@
         </w:r>
       </w:hyperlink>
       <w:r>
-        <w:t xml:space="preserve"> </w:t>
-      </w:r>
-      <w:r>
-        <w:t xml:space="preserve">(left three, 6 trials, 45s cap) and three grids from the paper’s own scraped-</w:t>
-      </w:r>
-      <m:oMath>
-        <m:r>
-          <m:t>15</m:t>
-        </m:r>
-        <m:r>
-          <m:rPr>
-            <m:sty m:val="p"/>
-          </m:rPr>
-          <m:t>×</m:t>
-        </m:r>
-        <m:r>
-          <m:t>15</m:t>
-        </m:r>
-      </m:oMath>
-      <w:r>
-        <w:t xml:space="preserve"> </w:t>
-      </w:r>
-      <w:r>
-        <w:t xml:space="preserve">corpus (right three, 5 trials, 300s cap; the other 9 of 12 solve in under a second and are omitted). Bars mark the median; hollow points hit the cap. Shared weights are not uniformly better: the same win/wash/loss pattern appears independently on both grid sets.</w:t>
-      </w:r>
-    </w:p>
-    <w:bookmarkEnd w:id="33"/>
-    <w:bookmarkEnd w:id="34"/>
-    <w:bookmarkStart w:id="35" w:name="sec:ablation"/>
-    <w:p>
-      <w:pPr>
-        <w:pStyle w:val="Heading2"/>
-      </w:pPr>
-      <w:r>
-        <w:t xml:space="preserve">Isolating the Mechanism: A Shared-Weight Ablation</w:t>
+        <w:t xml:space="preserve">’s mixed result: shared conflict weights change which draw from the tail each worker takes, which can land on a worse draw as easily as a better one, netting out as an improvement only once averaged over a broader, typical corpus.</w:t>
+      </w:r>
+    </w:p>
+    <w:bookmarkEnd w:id="37"/>
+    <w:bookmarkStart w:id="38" w:name="limitations-and-conclusion"/>
+    <w:p>
+      <w:pPr>
+        <w:pStyle w:val="Heading1"/>
+      </w:pPr>
+      <w:r>
+        <w:t xml:space="preserve">Limitations and Conclusion</w:t>
       </w:r>
     </w:p>
     <w:p>
@@ -2024,22 +2241,37 @@
         <w:pStyle w:val="FirstParagraph"/>
       </w:pPr>
       <w:r>
-        <w:t xml:space="preserve">Everything above tests xfill’s architecture against a different codebase’s; this section tests xfill against itself, with one environment variable flipped: same solver, same grid, same dictionary, same 14 threads,</w:t>
-      </w:r>
-      <w:r>
-        <w:t xml:space="preserve"> </w:t>
-      </w:r>
-      <w:r>
-        <w:rPr>
-          <w:rStyle w:val="VerbatimChar"/>
-        </w:rPr>
-        <w:t xml:space="preserve">XFILL_DISABLE_SHARED_WEIGHTS</w:t>
-      </w:r>
-      <w:r>
-        <w:t xml:space="preserve"> </w:t>
-      </w:r>
-      <w:r>
-        <w:t xml:space="preserve">on and off, several trials each, on grids from two independent sources: the known-hard list used throughout Section </w:t>
+        <w:t xml:space="preserve">All timing results are from one 14-core machine and one dictionary derived from a specific freely available word list; neither the thread-scaling numbers nor Section </w:t>
+      </w:r>
+      <w:hyperlink w:anchor="sec:exhaustive">
+        <w:r>
+          <w:rPr>
+            <w:rStyle w:val="Hyperlink"/>
+          </w:rPr>
+          <w:t xml:space="preserve">5.7</w:t>
+        </w:r>
+      </w:hyperlink>
+      <w:r>
+        <w:t xml:space="preserve">’s unsatisfiability result should be read as hardware- or dictionary-independent claims. Both principal solvers are actively developed; exact commit hashes are recorded in the testbench README.</w:t>
+      </w:r>
+    </w:p>
+    <w:p>
+      <w:pPr>
+        <w:pStyle w:val="BodyText"/>
+      </w:pPr>
+      <w:r>
+        <w:t xml:space="preserve">This paper’s contribution is the mechanism in Section </w:t>
+      </w:r>
+      <w:hyperlink w:anchor="sec:arch">
+        <w:r>
+          <w:rPr>
+            <w:rStyle w:val="Hyperlink"/>
+          </w:rPr>
+          <w:t xml:space="preserve">3</w:t>
+        </w:r>
+      </w:hyperlink>
+      <w:r>
+        <w:t xml:space="preserve">: concurrent conflict-weight sharing across a restart portfolio that never partitions, occupying a gap that three adjacent lines of prior work leave open. The architectural comparison in Section </w:t>
       </w:r>
       <w:hyperlink w:anchor="sec:experiments">
         <w:r>
@@ -2050,389 +2282,6 @@
         </w:r>
       </w:hyperlink>
       <w:r>
-        <w:t xml:space="preserve">, and three grids from the paper’s own main scraped-</w:t>
-      </w:r>
-      <m:oMath>
-        <m:r>
-          <m:t>15</m:t>
-        </m:r>
-        <m:r>
-          <m:rPr>
-            <m:sty m:val="p"/>
-          </m:rPr>
-          <m:t>×</m:t>
-        </m:r>
-        <m:r>
-          <m:t>15</m:t>
-        </m:r>
-      </m:oMath>
-      <w:r>
-        <w:t xml:space="preserve"> </w:t>
-      </w:r>
-      <w:r>
-        <w:t xml:space="preserve">corpus, to check the first result is not an artifact of one curated list.</w:t>
-      </w:r>
-    </w:p>
-    <w:p>
-      <w:pPr>
-        <w:pStyle w:val="BodyText"/>
-      </w:pPr>
-      <w:r>
-        <w:t xml:space="preserve">Fig. </w:t>
-      </w:r>
-      <w:hyperlink w:anchor="fig:ablation">
-        <w:r>
-          <w:rPr>
-            <w:rStyle w:val="Hyperlink"/>
-          </w:rPr>
-          <w:t xml:space="preserve">4</w:t>
-        </w:r>
-      </w:hyperlink>
-      <w:r>
-        <w:t xml:space="preserve"> </w:t>
-      </w:r>
-      <w:r>
-        <w:t xml:space="preserve">does</w:t>
-      </w:r>
-      <w:r>
-        <w:t xml:space="preserve"> </w:t>
-      </w:r>
-      <w:r>
-        <w:rPr>
-          <w:i/>
-          <w:iCs/>
-        </w:rPr>
-        <w:t xml:space="preserve">not</w:t>
-      </w:r>
-      <w:r>
-        <w:t xml:space="preserve"> </w:t>
-      </w:r>
-      <w:r>
-        <w:t xml:space="preserve">show a uniform win, on either grid set, and we report that plainly. On</w:t>
-      </w:r>
-      <w:r>
-        <w:t xml:space="preserve"> </w:t>
-      </w:r>
-      <w:r>
-        <w:rPr>
-          <w:rStyle w:val="VerbatimChar"/>
-        </w:rPr>
-        <w:t xml:space="preserve">grid_053</w:t>
-      </w:r>
-      <w:r>
-        <w:t xml:space="preserve">, the unshared baseline is faster on the median (0.72s vs. 2.77s) and far tighter (0.66–0.76s vs. 0.07–3.71s). On</w:t>
-      </w:r>
-      <w:r>
-        <w:t xml:space="preserve"> </w:t>
-      </w:r>
-      <w:r>
-        <w:rPr>
-          <w:rStyle w:val="VerbatimChar"/>
-        </w:rPr>
-        <w:t xml:space="preserve">grid_058</w:t>
-      </w:r>
-      <w:r>
-        <w:t xml:space="preserve"> </w:t>
-      </w:r>
-      <w:r>
-        <w:t xml:space="preserve">and</w:t>
-      </w:r>
-      <w:r>
-        <w:t xml:space="preserve"> </w:t>
-      </w:r>
-      <w:r>
-        <w:rPr>
-          <w:rStyle w:val="VerbatimChar"/>
-        </w:rPr>
-        <w:t xml:space="preserve">grid_479</w:t>
-      </w:r>
-      <w:r>
-        <w:t xml:space="preserve">, medians are similar but shared weights show wider spread. On</w:t>
-      </w:r>
-      <w:r>
-        <w:t xml:space="preserve"> </w:t>
-      </w:r>
-      <w:r>
-        <w:rPr>
-          <w:rStyle w:val="VerbatimChar"/>
-        </w:rPr>
-        <w:t xml:space="preserve">grid_120</w:t>
-      </w:r>
-      <w:r>
-        <w:t xml:space="preserve">, shared weights reach a lower best case but also produce the only outright timeout among those eighteen trials.</w:t>
-      </w:r>
-      <w:r>
-        <w:t xml:space="preserve"> </w:t>
-      </w:r>
-      <w:r>
-        <w:rPr>
-          <w:rStyle w:val="VerbatimChar"/>
-        </w:rPr>
-        <w:t xml:space="preserve">grid_395</w:t>
-      </w:r>
-      <w:r>
-        <w:t xml:space="preserve"> </w:t>
-      </w:r>
-      <w:r>
-        <w:t xml:space="preserve">and</w:t>
-      </w:r>
-      <w:r>
-        <w:t xml:space="preserve"> </w:t>
-      </w:r>
-      <w:r>
-        <w:rPr>
-          <w:rStyle w:val="VerbatimChar"/>
-        </w:rPr>
-        <w:t xml:space="preserve">grid_423</w:t>
-      </w:r>
-      <w:r>
-        <w:t xml:space="preserve"> </w:t>
-      </w:r>
-      <w:r>
-        <w:t xml:space="preserve">sharpen both directions: a clean</w:t>
-      </w:r>
-      <w:r>
-        <w:t xml:space="preserve"> </w:t>
-      </w:r>
-      <m:oMath>
-        <m:r>
-          <m:t>7</m:t>
-        </m:r>
-      </m:oMath>
-      <w:r>
-        <w:t xml:space="preserve">–</w:t>
-      </w:r>
-      <m:oMath>
-        <m:r>
-          <m:t>10</m:t>
-        </m:r>
-        <m:r>
-          <m:rPr>
-            <m:sty m:val="p"/>
-          </m:rPr>
-          <m:t>×</m:t>
-        </m:r>
-      </m:oMath>
-      <w:r>
-        <w:t xml:space="preserve"> </w:t>
-      </w:r>
-      <w:r>
-        <w:t xml:space="preserve">win on the former (36.9s vs. 271.4s median), and actively worse on the latter – all 5 trials hit the 300s cap, where disabling shared weights solves it reliably at</w:t>
-      </w:r>
-      <w:r>
-        <w:t xml:space="preserve"> </w:t>
-      </w:r>
-      <m:oMath>
-        <m:r>
-          <m:rPr>
-            <m:sty m:val="p"/>
-          </m:rPr>
-          <m:t>∼</m:t>
-        </m:r>
-      </m:oMath>
-      <w:r>
-        <w:t xml:space="preserve">180s every time. That last result complicates Section </w:t>
-      </w:r>
-      <w:hyperlink w:anchor="sec:speedup">
-        <w:r>
-          <w:rPr>
-            <w:rStyle w:val="Hyperlink"/>
-          </w:rPr>
-          <w:t xml:space="preserve">5.5</w:t>
-        </w:r>
-      </w:hyperlink>
-      <w:r>
-        <w:t xml:space="preserve">: the same run that gave xfill its completion advantage over orca-solver on</w:t>
-      </w:r>
-      <w:r>
-        <w:t xml:space="preserve"> </w:t>
-      </w:r>
-      <w:r>
-        <w:rPr>
-          <w:rStyle w:val="VerbatimChar"/>
-        </w:rPr>
-        <w:t xml:space="preserve">grid_423</w:t>
-      </w:r>
-      <w:r>
-        <w:t xml:space="preserve"> </w:t>
-      </w:r>
-      <w:r>
-        <w:t xml:space="preserve">also timed out in 2 of its own 5 trials – shared weights are exactly what make that grid unreliable for xfill in the first place. Against Section </w:t>
-      </w:r>
-      <w:hyperlink w:anchor="sec:arch">
-        <w:r>
-          <w:rPr>
-            <w:rStyle w:val="Hyperlink"/>
-          </w:rPr>
-          <w:t xml:space="preserve">3</w:t>
-        </w:r>
-      </w:hyperlink>
-      <w:r>
-        <w:t xml:space="preserve">’s broader-corpus finding of a consistent win, the synthesis is regime-dependent: shared weights help on typical grids by redistributing which crossings each worker deprioritizes, but at the extreme difficulty end they trade tight, well-behaved variance for a wider one that is not reliably better, and sometimes reliably worse. We have no evidence for a uniform win, so we do not claim one – the same standard Section </w:t>
-      </w:r>
-      <w:hyperlink w:anchor="sec:negative">
-        <w:r>
-          <w:rPr>
-            <w:rStyle w:val="Hyperlink"/>
-          </w:rPr>
-          <w:t xml:space="preserve">4</w:t>
-        </w:r>
-      </w:hyperlink>
-      <w:r>
-        <w:t xml:space="preserve"> </w:t>
-      </w:r>
-      <w:r>
-        <w:t xml:space="preserve">applies to the heuristics it rules out.</w:t>
-      </w:r>
-    </w:p>
-    <w:bookmarkEnd w:id="35"/>
-    <w:bookmarkEnd w:id="36"/>
-    <w:bookmarkStart w:id="37" w:name="discussion"/>
-    <w:p>
-      <w:pPr>
-        <w:pStyle w:val="Heading1"/>
-      </w:pPr>
-      <w:r>
-        <w:t xml:space="preserve">Discussion</w:t>
-      </w:r>
-    </w:p>
-    <w:p>
-      <w:pPr>
-        <w:pStyle w:val="FirstParagraph"/>
-      </w:pPr>
-      <w:r>
-        <w:t xml:space="preserve">The architectural comparison and the mechanism ablation share one underlying cause: restart portfolios benefit from heavy-tailed runtimes, so more independent draws raise the chance of an early lucky one, which is why oversubscribing thread count helped in Section </w:t>
-      </w:r>
-      <w:hyperlink w:anchor="sec:oversub">
-        <w:r>
-          <w:rPr>
-            <w:rStyle w:val="Hyperlink"/>
-          </w:rPr>
-          <w:t xml:space="preserve">5.2</w:t>
-        </w:r>
-      </w:hyperlink>
-      <w:r>
-        <w:t xml:space="preserve"> </w:t>
-      </w:r>
-      <w:r>
-        <w:t xml:space="preserve">and Fig. </w:t>
-      </w:r>
-      <w:hyperlink w:anchor="fig:scaling">
-        <w:r>
-          <w:rPr>
-            <w:rStyle w:val="Hyperlink"/>
-          </w:rPr>
-          <w:t xml:space="preserve">1</w:t>
-        </w:r>
-      </w:hyperlink>
-      <w:r>
-        <w:t xml:space="preserve">, and why</w:t>
-      </w:r>
-      <w:r>
-        <w:t xml:space="preserve"> </w:t>
-      </w:r>
-      <w:r>
-        <w:rPr>
-          <w:rStyle w:val="VerbatimChar"/>
-        </w:rPr>
-        <w:t xml:space="preserve">grid_423</w:t>
-      </w:r>
-      <w:r>
-        <w:t xml:space="preserve"> </w:t>
-      </w:r>
-      <w:r>
-        <w:t xml:space="preserve">(Fig. </w:t>
-      </w:r>
-      <w:hyperlink w:anchor="fig:speedup">
-        <w:r>
-          <w:rPr>
-            <w:rStyle w:val="Hyperlink"/>
-          </w:rPr>
-          <w:t xml:space="preserve">3</w:t>
-        </w:r>
-      </w:hyperlink>
-      <w:r>
-        <w:t xml:space="preserve">) goes further: more draws can succeed where a fixed partition cannot. Partitioned search instead gives genuine non-overlapping coverage, which is what Section </w:t>
-      </w:r>
-      <w:hyperlink w:anchor="sec:exhaustive">
-        <w:r>
-          <w:rPr>
-            <w:rStyle w:val="Hyperlink"/>
-          </w:rPr>
-          <w:t xml:space="preserve">5.6</w:t>
-        </w:r>
-      </w:hyperlink>
-      <w:r>
-        <w:t xml:space="preserve">’s proof of unsatisfiability required. The same heavy-tailedness explains Fig. </w:t>
-      </w:r>
-      <w:hyperlink w:anchor="fig:ablation">
-        <w:r>
-          <w:rPr>
-            <w:rStyle w:val="Hyperlink"/>
-          </w:rPr>
-          <w:t xml:space="preserve">4</w:t>
-        </w:r>
-      </w:hyperlink>
-      <w:r>
-        <w:t xml:space="preserve">’s mixed result: shared conflict weights change which draw from the tail each worker takes, which can land on a worse draw as easily as a better one, netting out as an improvement only once averaged over a broader, typical corpus.</w:t>
-      </w:r>
-    </w:p>
-    <w:bookmarkEnd w:id="37"/>
-    <w:bookmarkStart w:id="38" w:name="limitations-and-conclusion"/>
-    <w:p>
-      <w:pPr>
-        <w:pStyle w:val="Heading1"/>
-      </w:pPr>
-      <w:r>
-        <w:t xml:space="preserve">Limitations and Conclusion</w:t>
-      </w:r>
-    </w:p>
-    <w:p>
-      <w:pPr>
-        <w:pStyle w:val="FirstParagraph"/>
-      </w:pPr>
-      <w:r>
-        <w:t xml:space="preserve">All timing results are from one 14-core machine and one dictionary derived from a specific freely available word list; neither the thread-scaling numbers nor Section </w:t>
-      </w:r>
-      <w:hyperlink w:anchor="sec:exhaustive">
-        <w:r>
-          <w:rPr>
-            <w:rStyle w:val="Hyperlink"/>
-          </w:rPr>
-          <w:t xml:space="preserve">5.6</w:t>
-        </w:r>
-      </w:hyperlink>
-      <w:r>
-        <w:t xml:space="preserve">’s unsatisfiability result should be read as hardware- or dictionary-independent claims. Both principal solvers are actively developed; exact commit hashes are recorded in the testbench README.</w:t>
-      </w:r>
-    </w:p>
-    <w:p>
-      <w:pPr>
-        <w:pStyle w:val="BodyText"/>
-      </w:pPr>
-      <w:r>
-        <w:t xml:space="preserve">This paper’s contribution is the mechanism in Section </w:t>
-      </w:r>
-      <w:hyperlink w:anchor="sec:arch">
-        <w:r>
-          <w:rPr>
-            <w:rStyle w:val="Hyperlink"/>
-          </w:rPr>
-          <w:t xml:space="preserve">3</w:t>
-        </w:r>
-      </w:hyperlink>
-      <w:r>
-        <w:t xml:space="preserve">: concurrent conflict-weight sharing across a restart portfolio that never partitions, occupying a gap that three adjacent lines of prior work leave open. The architectural comparison in Section </w:t>
-      </w:r>
-      <w:hyperlink w:anchor="sec:experiments">
-        <w:r>
-          <w:rPr>
-            <w:rStyle w:val="Hyperlink"/>
-          </w:rPr>
-          <w:t xml:space="preserve">5</w:t>
-        </w:r>
-      </w:hyperlink>
-      <w:r>
         <w:t xml:space="preserve"> </w:t>
       </w:r>
       <w:r>
@@ -2468,7 +2317,7 @@
         <w:pStyle w:val="FirstParagraph"/>
       </w:pPr>
       <w:r>
-        <w:t xml:space="preserve">[Advisor/funding acknowledgments.]</w:t>
+        <w:t xml:space="preserve">This work received no external funding or advisor supervision. The author used Claude Code (Anthropic), an AI coding assistant, throughout the project: to help implement and test the xfill solver, to build the benchmarking infrastructure and run the experiments reported here, to generate the figures, and to draft and revise this manuscript. The author reviewed, verified, and takes full responsibility for all code, experimental results, and conclusions in this paper.</w:t>
       </w:r>
     </w:p>
     <w:p>
@@ -2756,6 +2605,18 @@
       <w:pPr>
         <w:pStyle w:val="BodyText"/>
       </w:pPr>
+      <w:r>
+        <w:t xml:space="preserve">Crosswordgrids.com,</w:t>
+      </w:r>
+      <w:r>
+        <w:t xml:space="preserve"> </w:t>
+      </w:r>
+      <w:r>
+        <w:t xml:space="preserve">“15x15 crossword grids,”</w:t>
+      </w:r>
+      <w:r>
+        <w:t xml:space="preserve"> </w:t>
+      </w:r>
       <w:hyperlink r:id="rId39">
         <w:r>
           <w:rPr>

</xml_diff>

<commit_message>
Fix reference formatting per IEEE Reference Style Guide
ehlers2016 was missing required page numbers for a published conference
paper (added pp. 142-158, verified via DBLP); the crosswordgrids website
reference lacked an accessed date, the [Online.] tag, and a URL scheme,
none of which match IEEE's website reference template. Rest of the paper
audited against the Editorial Style Manual (contractions, Oxford comma,
that/which, hyphenation, AI disclosure) with no other issues found.

Co-Authored-By: Claude Sonnet 5 <noreply@anthropic.com>
</commit_message>
<xml_diff>
--- a/paper/xfill_urtc2026.docx
+++ b/paper/xfill_urtc2026.docx
@@ -2538,7 +2538,7 @@
         <w:t xml:space="preserve">Proc. CPAIOR</w:t>
       </w:r>
       <w:r>
-        <w:t xml:space="preserve">, LNCS vol. 9676, Banff, Canada, 2016.</w:t>
+        <w:t xml:space="preserve">, LNCS vol. 9676, Banff, AB, Canada, 2016, pp. 142–158.</w:t>
       </w:r>
     </w:p>
     <w:p>
@@ -2606,13 +2606,19 @@
         <w:pStyle w:val="BodyText"/>
       </w:pPr>
       <w:r>
-        <w:t xml:space="preserve">Crosswordgrids.com,</w:t>
-      </w:r>
-      <w:r>
-        <w:t xml:space="preserve"> </w:t>
-      </w:r>
-      <w:r>
-        <w:t xml:space="preserve">“15x15 crossword grids,”</w:t>
+        <w:t xml:space="preserve">Crosswordgrids.com.</w:t>
+      </w:r>
+      <w:r>
+        <w:t xml:space="preserve"> </w:t>
+      </w:r>
+      <w:r>
+        <w:t xml:space="preserve">“15x15 crossword grids.”</w:t>
+      </w:r>
+      <w:r>
+        <w:t xml:space="preserve"> </w:t>
+      </w:r>
+      <w:r>
+        <w:t xml:space="preserve">Accessed: Jul. 29, 2026. [Online.] Available:</w:t>
       </w:r>
       <w:r>
         <w:t xml:space="preserve"> </w:t>
@@ -2622,7 +2628,7 @@
           <w:rPr>
             <w:rStyle w:val="Hyperlink"/>
           </w:rPr>
-          <w:t xml:space="preserve">crosswordgrids.com/15x15-crossword-grids</w:t>
+          <w:t xml:space="preserve">https://crosswordgrids.com/15x15-crossword-grids</w:t>
         </w:r>
       </w:hyperlink>
     </w:p>

</xml_diff>

<commit_message>
Fix two factual errors found on final proofread
Section IV's branching-heuristic enumeration said "two minimum-remaining-
value scoring rules" but summed to four while the surrounding text says
"five" three times; docs/design.md's original account lists three MRV
variants (letter-count, joint two-sided, true global cell), so the count
was undercounted by one. The abstract separately claimed xfill solved 14
real, previously published 15x15 grids; the real count is 12 (verified
against results.csv) -- the other two are synthetically generated
curated-set grids, not real/published ones. Also fixed an internal
contradiction in Section V-F, which stated orca-solver fails on grid_423
and then two sentences later claimed both solvers fail only on
sample_13x13. Trimmed a redundant clause elsewhere to hold the page count
at 5.

Co-Authored-By: Claude Sonnet 5 <noreply@anthropic.com>
</commit_message>
<xml_diff>
--- a/paper/xfill_urtc2026.docx
+++ b/paper/xfill_urtc2026.docx
@@ -28,7 +28,7 @@
         <w:pStyle w:val="Abstract"/>
       </w:pPr>
       <w:r>
-        <w:t xml:space="preserve">Parallel CSP solvers typically take one of two forms: partition the search space across workers, or run an undivided portfolio of independent restarts. When CSP workers share information at all, prior work treats that sharing as a one-time input to partitioning, gathered once and then spent. This paper describes a different mechanism: a restart portfolio whose workers never partition the problem, but continuously and concurrently update a shared pool of dom/wdeg-style conflict weights throughout the search, with no manager and no synchronization phase. We implement it in xfill, a word-level CSP solver for crossword filling, and test it two ways. First, we establish that restart-portfolio search as a class occupies a genuinely different point in the design space than partition-based search, using orca-solver, an independently developed partition-based solver, as a concrete representative of the alternative. Restart portfolios exploit heavy-tailed search-runtime distributions: oversubscribing thread count past the physical core count improves xfill by roughly 65 times on one hard grid, while the partition-based solver improves only marginally and cannot solve it at all below 14 threads. On realistic-scale instances, xfill solves every one of 14 real, previously published 15x15 grids tested, and on the 11 where the partition-based solver also succeeds, xfill is faster on 9, by a geometric mean of about 107 times. Partitioning, conversely, gives genuine non-overlapping coverage, a real advantage for proving unsatisfiability. Second, and more directly on point, we isolate the shared-weight mechanism itself, holding the solver and grid fixed and toggling only the mechanism, and find a more nuanced result than the architectural comparison above: consistent improvement on a broad corpus of moderate-difficulty grids, but higher variance rather than a reliable win on especially hard instances. A negative or mixed result for one’s own mechanism is still evidence, so we present it alongside the positive one rather than in place of it. We also report a negative result from the same codebase: five independently plausible letter-level branching heuristics produced numerically identical output on our hardest benchmark grid, because a domain-size precondition meant none of them ever executed, caught only by direct execution-path instrumentation and not by comparing benchmark scores.</w:t>
+        <w:t xml:space="preserve">Parallel CSP solvers typically take one of two forms: partition the search space across workers, or run an undivided portfolio of independent restarts. When CSP workers share information at all, prior work treats that sharing as a one-time input to partitioning, gathered once and then spent. This paper describes a different mechanism: a restart portfolio whose workers never partition the problem, but continuously and concurrently update a shared pool of dom/wdeg-style conflict weights throughout the search, with no manager and no synchronization phase. We implement it in xfill, a word-level CSP solver for crossword filling, and test it two ways. First, we establish that restart-portfolio search as a class occupies a genuinely different point in the design space than partition-based search, using orca-solver, an independently developed partition-based solver, as a concrete representative of the alternative. Restart portfolios exploit heavy-tailed search-runtime distributions: oversubscribing thread count past the physical core count improves xfill by roughly 65 times on one hard grid, while the partition-based solver improves only marginally and cannot solve it at all below 14 threads. On realistic-scale instances, xfill solves every one of 12 real, previously published 15x15 grids tested, and on the 11 where the partition-based solver also succeeds, xfill is faster on 9, by a geometric mean of about 107 times. Partitioning, conversely, gives genuine non-overlapping coverage, a real advantage for proving unsatisfiability. Second, and more directly on point, we isolate the shared-weight mechanism itself, holding the solver and grid fixed and toggling only the mechanism, and find a more nuanced result than the architectural comparison above: consistent improvement on a broad corpus of moderate-difficulty grids, but higher variance rather than a reliable win on especially hard instances. A negative or mixed result for one’s own mechanism is still evidence, so we present it alongside the positive one rather than in place of it. We also report a negative result from the same codebase: five independently plausible letter-level branching heuristics produced numerically identical output on our hardest benchmark grid, because a domain-size precondition meant none of them ever executed, caught only by direct execution-path instrumentation and not by comparing benchmark scores.</w:t>
       </w:r>
     </w:p>
     <w:p>
@@ -538,7 +538,7 @@
         </m:r>
       </m:oMath>
       <w:r>
-        <w:t xml:space="preserve">; and ThreadSanitizer, run against real multi-threaded solves, reports no data races, consistent with every update being independent of order. In earlier development-time testing across a broad corpus of moderate-difficulty grids (documented in</w:t>
+        <w:t xml:space="preserve">; and ThreadSanitizer, run against real multi-threaded solves, reports no data races. In earlier development-time testing across a broad corpus of moderate-difficulty grids (documented in</w:t>
       </w:r>
       <w:r>
         <w:t xml:space="preserve"> </w:t>
@@ -613,7 +613,7 @@
         </w:r>
       </w:hyperlink>
       <w:r>
-        <w:t xml:space="preserve">), we implemented five letter-level branching variants – two minimum-remaining-value scoring rules, a faithful reimplementation of a partition-based solver’s own candidate scoring, and a reversed scan order – reasoning that a smaller per-node branching factor should help on wide-open grids.</w:t>
+        <w:t xml:space="preserve">), we implemented five letter-level branching variants – three minimum-remaining-value scoring rules, a faithful reimplementation of a partition-based solver’s own candidate scoring, and a reversed scan order – reasoning that a smaller per-node branching factor should help on wide-open grids.</w:t>
       </w:r>
     </w:p>
     <w:p>
@@ -1999,10 +1999,7 @@
         </w:r>
       </w:hyperlink>
       <w:r>
-        <w:t xml:space="preserve">). Across the full 20-grid sample, xfill resolves 19, orca-solver 18, both agree on the sample’s one correct UNSAT proof, and both are stuck only on</w:t>
-      </w:r>
-      <w:r>
-        <w:t xml:space="preserve"> </w:t>
+        <w:t xml:space="preserve">). Across the full 20-grid sample, xfill resolves 19, orca-solver 18, both agree on the sample’s one correct UNSAT proof, and xfill’s one failure (</w:t>
       </w:r>
       <w:r>
         <w:rPr>
@@ -2011,10 +2008,22 @@
         <w:t xml:space="preserve">sample_13x13</w:t>
       </w:r>
       <w:r>
-        <w:t xml:space="preserve"> </w:t>
-      </w:r>
-      <w:r>
-        <w:t xml:space="preserve">– a narrower gap on success alone than on speed, which is why Sections </w:t>
+        <w:t xml:space="preserve">) is a subset of orca-solver’s two,</w:t>
+      </w:r>
+      <w:r>
+        <w:t xml:space="preserve"> </w:t>
+      </w:r>
+      <w:r>
+        <w:rPr>
+          <w:rStyle w:val="VerbatimChar"/>
+        </w:rPr>
+        <w:t xml:space="preserve">grid_423</w:t>
+      </w:r>
+      <w:r>
+        <w:t xml:space="preserve"> </w:t>
+      </w:r>
+      <w:r>
+        <w:t xml:space="preserve">being the other – a narrower gap on success alone than on speed, which is why Sections </w:t>
       </w:r>
       <w:hyperlink w:anchor="sec:scaling">
         <w:r>

</xml_diff>

<commit_message>
Define CSP on first use in abstract and body per IEEE editorial style
Both occurrences previously used the bare acronym; IEEE requires
spelling out on first use independently in the abstract and body text.

Co-Authored-By: Claude Sonnet 5 <noreply@anthropic.com>
</commit_message>
<xml_diff>
--- a/paper/xfill_urtc2026.docx
+++ b/paper/xfill_urtc2026.docx
@@ -28,7 +28,7 @@
         <w:pStyle w:val="Abstract"/>
       </w:pPr>
       <w:r>
-        <w:t xml:space="preserve">Parallel CSP solvers typically take one of two forms: partition the search space across workers, or run an undivided portfolio of independent restarts. When CSP workers share information at all, prior work treats that sharing as a one-time input to partitioning, gathered once and then spent. This paper describes a different mechanism: a restart portfolio whose workers never partition the problem, but continuously and concurrently update a shared pool of dom/wdeg-style conflict weights throughout the search, with no manager and no synchronization phase. We implement it in xfill, a word-level CSP solver for crossword filling, and test it two ways. First, we establish that restart-portfolio search as a class occupies a genuinely different point in the design space than partition-based search, using orca-solver, an independently developed partition-based solver, as a concrete representative of the alternative. Restart portfolios exploit heavy-tailed search-runtime distributions: oversubscribing thread count past the physical core count improves xfill by roughly 65 times on one hard grid, while the partition-based solver improves only marginally and cannot solve it at all below 14 threads. On realistic-scale instances, xfill solves every one of 12 real, previously published 15x15 grids tested, and on the 11 where the partition-based solver also succeeds, xfill is faster on 9, by a geometric mean of about 107 times. Partitioning, conversely, gives genuine non-overlapping coverage, a real advantage for proving unsatisfiability. Second, and more directly on point, we isolate the shared-weight mechanism itself, holding the solver and grid fixed and toggling only the mechanism, and find a more nuanced result than the architectural comparison above: consistent improvement on a broad corpus of moderate-difficulty grids, but higher variance rather than a reliable win on especially hard instances. A negative or mixed result for one’s own mechanism is still evidence, so we present it alongside the positive one rather than in place of it. We also report a negative result from the same codebase: five independently plausible letter-level branching heuristics produced numerically identical output on our hardest benchmark grid, because a domain-size precondition meant none of them ever executed, caught only by direct execution-path instrumentation and not by comparing benchmark scores.</w:t>
+        <w:t xml:space="preserve">Parallel constraint satisfaction problem (CSP) solvers typically take one of two forms: partition the search space across workers, or run an undivided portfolio of independent restarts. When CSP workers share information at all, prior work treats that sharing as a one-time input to partitioning, gathered once and then spent. This paper describes a different mechanism: a restart portfolio whose workers never partition the problem, but continuously and concurrently update a shared pool of dom/wdeg-style conflict weights throughout the search, with no manager and no synchronization phase. We implement it in xfill, a word-level CSP solver for crossword filling, and test it two ways. First, we establish that restart-portfolio search as a class occupies a genuinely different point in the design space than partition-based search, using orca-solver, an independently developed partition-based solver, as a concrete representative of the alternative. Restart portfolios exploit heavy-tailed search-runtime distributions: oversubscribing thread count past the physical core count improves xfill by roughly 65 times on one hard grid, while the partition-based solver improves only marginally and cannot solve it at all below 14 threads. On realistic-scale instances, xfill solves every one of 12 real, previously published 15x15 grids tested, and on the 11 where the partition-based solver also succeeds, xfill is faster on 9, by a geometric mean of about 107 times. Partitioning, conversely, gives genuine non-overlapping coverage, a real advantage for proving unsatisfiability. Second, and more directly on point, we isolate the shared-weight mechanism itself, holding the solver and grid fixed and toggling only the mechanism, and find a more nuanced result than the architectural comparison above: consistent improvement on a broad corpus of moderate-difficulty grids, but higher variance rather than a reliable win on especially hard instances. A negative or mixed result for one’s own mechanism is still evidence, so we present it alongside the positive one rather than in place of it. We also report a negative result from the same codebase: five independently plausible letter-level branching heuristics produced numerically identical output on our hardest benchmark grid, because a domain-size precondition meant none of them ever executed, caught only by direct execution-path instrumentation and not by comparing benchmark scores.</w:t>
       </w:r>
     </w:p>
     <w:p>
@@ -53,7 +53,7 @@
         <w:pStyle w:val="FirstParagraph"/>
       </w:pPr>
       <w:r>
-        <w:t xml:space="preserve">Crossword filling – assigning a dictionary word to every slot in a grid so every crossing letter agrees – is a word-level CSP and a convenient search-research testbed: instances are human-legible, difficulty is controllable directly through grid geometry, and independently developed solvers already exist to compare against. Ginsberg’s Dr.Fill</w:t>
+        <w:t xml:space="preserve">Crossword filling – assigning a dictionary word to every slot in a grid so every crossing letter agrees – is a word-level constraint satisfaction problem (CSP) and a convenient search-research testbed: instances are human-legible, difficulty is controllable directly through grid geometry, and independently developed solvers already exist to compare against. Ginsberg’s Dr.Fill</w:t>
       </w:r>
       <w:r>
         <w:t xml:space="preserve"> </w:t>

</xml_diff>

<commit_message>
Editing passes 1-6: minor redundancy trims, em-dash correction
Cut one more repeated concept ("repository" appearing 3x in two
adjacent paragraphs), smoothed one awkward propagation-definition
phrase, fixed one within-sentence word repetition ("repository" twice),
split one 60+ word Discussion sentence with two stacked "which is
why...and why..." clauses.

Larger finding: all 43 parenthetical-aside dashes in the body used a
spaced en-dash ("--", with spaces) rather than IEEE's specified em-dash
for that role (unspaced "---"). The paper's few genuine ranges (page
numbers, value ranges) were already correctly unspaced en-dashes and
untouched. Converted via a spaced-only sed pass (verified zero spaced
dashes existed in the bibliography beforehand, so nothing there was at
risk), then visually confirmed correct em-dash rendering.

Recompiled clean at exactly 5 pages.

Co-Authored-By: Claude Sonnet 5 <noreply@anthropic.com>
</commit_message>
<xml_diff>
--- a/paper/xfill_urtc2026.docx
+++ b/paper/xfill_urtc2026.docx
@@ -28,7 +28,7 @@
         <w:pStyle w:val="Abstract"/>
       </w:pPr>
       <w:r>
-        <w:t xml:space="preserve">Parallel constraint satisfaction problem (CSP) solvers typically take one of two forms: partition the search space across workers, or run an undivided portfolio of independent restarts. When CSP workers share information at all, prior work treats that sharing as a one-time input to partitioning, gathered once and then spent. This paper describes a different mechanism: a restart portfolio whose workers never partition the problem, but continuously and concurrently update a shared pool of per-constraint conflict weights throughout the search, with no manager and no synchronization phase. We implement it in xfill, a word-level CSP solver for crossword filling, and test it two ways. First, we establish that restart-portfolio search as a class occupies a genuinely different point in the design space than partition-based search, using orca-solver, an independently developed partition-based solver, as a concrete representative of the alternative. Restart portfolios exploit heavy-tailed search-runtime distributions: oversubscribing thread count past the physical core count improves xfill by roughly 65 times on one hard grid, while the partition-based solver improves only marginally and cannot solve it at all below 14 threads. On realistic-scale instances, xfill solves every one of 12 real, previously published 15x15 grids tested, and on the 11 where the partition-based solver also succeeds, xfill is faster on 9, by a geometric mean of about 107 times. Partitioning, conversely, gives genuine non-overlapping coverage, a real advantage for proving unsatisfiability. Second – this paper’s actual contribution – we isolate the shared-weight mechanism itself, holding the solver and grid fixed and toggling only the mechanism, and find a more nuanced result than the architectural comparison above: consistent improvement on a broad corpus of moderate-difficulty grids, but higher variance rather than a reliable win on especially hard instances. A negative or mixed result for one’s own mechanism is still evidence, so we present it alongside the positive one rather than in place of it. We also report a negative result from the same codebase: five independently plausible letter-level branching heuristics produced numerically identical output on our hardest benchmark grid, because a domain-size precondition meant none of them ever executed, caught only by direct execution-path instrumentation and not by comparing benchmark scores.</w:t>
+        <w:t xml:space="preserve">Parallel constraint satisfaction problem (CSP) solvers typically take one of two forms: partition the search space across workers, or run an undivided portfolio of independent restarts. When CSP workers share information at all, prior work treats that sharing as a one-time input to partitioning, gathered once and then spent. This paper describes a different mechanism: a restart portfolio whose workers never partition the problem, but continuously and concurrently update a shared pool of per-constraint conflict weights throughout the search, with no manager and no synchronization phase. We implement it in xfill, a word-level CSP solver for crossword filling, and test it two ways. First, we establish that restart-portfolio search as a class occupies a genuinely different point in the design space than partition-based search, using orca-solver, an independently developed partition-based solver, as a concrete representative of the alternative. Restart portfolios exploit heavy-tailed search-runtime distributions: oversubscribing thread count past the physical core count improves xfill by roughly 65 times on one hard grid, while the partition-based solver improves only marginally and cannot solve it at all below 14 threads. On realistic-scale instances, xfill solves every one of 12 real, previously published 15x15 grids tested, and on the 11 where the partition-based solver also succeeds, xfill is faster on 9, by a geometric mean of about 107 times. Partitioning, conversely, gives genuine non-overlapping coverage, a real advantage for proving unsatisfiability. Second—this paper’s actual contribution—we isolate the shared-weight mechanism itself, holding the solver and grid fixed and toggling only the mechanism, and find a more nuanced result than the architectural comparison above: consistent improvement on a broad corpus of moderate-difficulty grids, but higher variance rather than a reliable win on especially hard instances. A negative or mixed result for one’s own mechanism is still evidence, so we present it alongside the positive one rather than in place of it. We also report a negative result from the same codebase: five independently plausible letter-level branching heuristics produced numerically identical output on our hardest benchmark grid, because a domain-size precondition meant none of them ever executed, caught only by direct execution-path instrumentation and not by comparing benchmark scores.</w:t>
       </w:r>
     </w:p>
     <w:p>
@@ -53,7 +53,7 @@
         <w:pStyle w:val="FirstParagraph"/>
       </w:pPr>
       <w:r>
-        <w:t xml:space="preserve">Crossword filling – assigning a dictionary word to every slot in a grid so every crossing letter agrees – is a word-level constraint satisfaction problem (CSP) and a convenient search-research testbed: instances are human-legible, difficulty is controllable directly through grid geometry, and independently developed solvers already exist to compare against. Ginsberg’s Dr.Fill</w:t>
+        <w:t xml:space="preserve">Crossword filling—assigning a dictionary word to every slot in a grid so every crossing letter agrees—is a word-level constraint satisfaction problem (CSP) and a convenient search-research testbed: instances are human-legible, difficulty is controllable directly through grid geometry, and independently developed solvers already exist to compare against. Ginsberg’s Dr.Fill</w:t>
       </w:r>
       <w:r>
         <w:t xml:space="preserve"> </w:t>
@@ -86,7 +86,7 @@
         <w:t xml:space="preserve"> </w:t>
       </w:r>
       <w:r>
-        <w:t xml:space="preserve">heuristic statistics – information that biases search order without asserting anything logically – continuously, without ever partitioning the problem those workers are solving? Section </w:t>
+        <w:t xml:space="preserve">heuristic statistics—information that biases search order without asserting anything logically—continuously, without ever partitioning the problem those workers are solving? Section </w:t>
       </w:r>
       <w:hyperlink w:anchor="sec:relwork">
         <w:r>
@@ -146,7 +146,7 @@
         <w:t xml:space="preserve"> </w:t>
       </w:r>
       <w:r>
-        <w:t xml:space="preserve">(1) a concurrent, decentralized conflict-weight-sharing mechanism for restart-portfolio CSP search, positioned precisely against the closest prior work; (2) a reproducible four-solver testbench that separates two claims – restart-portfolio search as an architectural class versus this specific mechanism within it – rather than conflating them; and (3) a methodological negative result about confirming a heuristic executes before trusting its benchmark comparison.</w:t>
+        <w:t xml:space="preserve">(1) a concurrent, decentralized conflict-weight-sharing mechanism for restart-portfolio CSP search, positioned precisely against the closest prior work; (2) a reproducible four-solver testbench that separates two claims—restart-portfolio search as an architectural class versus this specific mechanism within it—rather than conflating them; and (3) a methodological negative result about confirming a heuristic executes before trusting its benchmark comparison.</w:t>
       </w:r>
     </w:p>
     <w:bookmarkEnd w:id="9"/>
@@ -164,7 +164,7 @@
         <w:pStyle w:val="FirstParagraph"/>
       </w:pPr>
       <w:r>
-        <w:t xml:space="preserve">A CSP assigns values to variables from finite domains subject to constraints; systematic backtracking assigns one variable at a time, then propagates – removing values the new assignment now rules out elsewhere – and backtracks if some variable’s domain empties entirely (a</w:t>
+        <w:t xml:space="preserve">A CSP assigns values to variables from finite domains subject to constraints; systematic backtracking assigns one variable at a time, then propagates—removing now-impossible values from other variables’ domains—and backtracks if some variable’s domain empties entirely (a</w:t>
       </w:r>
       <w:r>
         <w:t xml:space="preserve"> </w:t>
@@ -290,16 +290,16 @@
         <w:t xml:space="preserve"> </w:t>
       </w:r>
       <w:r>
-        <w:t xml:space="preserve">solver – never concurrent. Ehlers and Stuckey</w:t>
-      </w:r>
-      <w:r>
-        <w:t xml:space="preserve"> </w:t>
-      </w:r>
-      <w:r>
-        <w:t xml:space="preserve"> </w:t>
-      </w:r>
-      <w:r>
-        <w:t xml:space="preserve">parallelize a lazy-clause-generation solver by sharing learnt nogoods (assignments proven infeasible) and objective bounds between workers – concurrent, but sharing</w:t>
+        <w:t xml:space="preserve">solver—never concurrent. Ehlers and Stuckey</w:t>
+      </w:r>
+      <w:r>
+        <w:t xml:space="preserve"> </w:t>
+      </w:r>
+      <w:r>
+        <w:t xml:space="preserve"> </w:t>
+      </w:r>
+      <w:r>
+        <w:t xml:space="preserve">parallelize a lazy-clause-generation solver by sharing learnt nogoods (assignments proven infeasible) and objective bounds between workers—concurrent, but sharing</w:t>
       </w:r>
       <w:r>
         <w:t xml:space="preserve"> </w:t>
@@ -388,7 +388,7 @@
         <w:t xml:space="preserve"> </w:t>
       </w:r>
       <w:r>
-        <w:t xml:space="preserve">documents extensive concurrent, non-partitioning multi-agent search – sharing hard facts (learned clauses, as in ManySAT) or concrete candidate-value hints – but no work sharing continuously updated soft heuristic weights among such workers.</w:t>
+        <w:t xml:space="preserve">documents extensive concurrent, non-partitioning multi-agent search—sharing hard facts (learned clauses, as in ManySAT) or concrete candidate-value hints—but no work sharing continuously updated soft heuristic weights among such workers.</w:t>
       </w:r>
     </w:p>
     <w:p>
@@ -448,7 +448,7 @@
         <w:t xml:space="preserve"> </w:t>
       </w:r>
       <w:r>
-        <w:t xml:space="preserve">cells) and crossings (cell-level intersections). Its sequential core performs dom/wdeg-style branching – selecting the slot minimizing domain size over accumulated</w:t>
+        <w:t xml:space="preserve">cells) and crossings (cell-level intersections). Its sequential core performs dom/wdeg-style branching—selecting the slot minimizing domain size over accumulated</w:t>
       </w:r>
       <w:r>
         <w:t xml:space="preserve"> </w:t>
@@ -461,10 +461,7 @@
         <w:t xml:space="preserve">crossing weight</w:t>
       </w:r>
       <w:r>
-        <w:t xml:space="preserve"> </w:t>
-      </w:r>
-      <w:r>
-        <w:t xml:space="preserve">– then propagates letter constraints via an AC-3-style queue (a standard constraint-propagation algorithm); a domain wipeout increases the responsible crossing’s weight.</w:t>
+        <w:t xml:space="preserve">—then propagates letter constraints via an AC-3-style queue (a standard constraint-propagation algorithm); a domain wipeout increases the responsible crossing’s weight.</w:t>
       </w:r>
     </w:p>
     <w:p>
@@ -537,7 +534,7 @@
         <w:t xml:space="preserve"> </w:t>
       </w:r>
       <w:r>
-        <w:t xml:space="preserve">maintains one array of plain atomic counters (thread-safe, uninterruptible updates), one per crossing, shared by every restart worker except the dedicated exhaustive one. Every worker increments a crossing’s counter on wipeout and reads every counter when scoring candidates. The counters are plain, order-independent atomic increments rather than a decaying scheme: a decaying normalizer is safe under concurrent writers only if there is just one writer, since it depends on the exact sequence of prior updates – true concurrent writers need an update rule that ignores order entirely. The dedicated exhaustive worker is excluded because its entire value is one undisturbed trajectory; wiring it in measurably hurt performance on the one grid in our corpus it had uniquely been able to solve. Two correctness properties were required: single-threaded calls stay byte-identical to the unshared baseline, since the mechanism only activates for thread count</w:t>
+        <w:t xml:space="preserve">maintains one array of plain atomic counters (thread-safe, uninterruptible updates), one per crossing, shared by every restart worker except the dedicated exhaustive one. Every worker increments a crossing’s counter on wipeout and reads every counter when scoring candidates. The counters are plain, order-independent atomic increments rather than a decaying scheme: a decaying normalizer is safe under concurrent writers only if there is just one writer, since it depends on the exact sequence of prior updates—true concurrent writers need an update rule that ignores order entirely. The dedicated exhaustive worker is excluded because its entire value is one undisturbed trajectory; wiring it in measurably hurt performance on the one grid in our corpus it had uniquely been able to solve. Two correctness properties were required: single-threaded calls stay byte-identical to the unshared baseline, since the mechanism only activates for thread count</w:t>
       </w:r>
       <w:r>
         <w:t xml:space="preserve"> </w:t>
@@ -566,7 +563,7 @@
         <w:t xml:space="preserve">docs/design.md</w:t>
       </w:r>
       <w:r>
-        <w:t xml:space="preserve">), this mechanism cut solve time broadly – a finding we revisit against a harder, targeted ablation in Section </w:t>
+        <w:t xml:space="preserve">), this mechanism cut solve time broadly—a finding we revisit against a harder, targeted ablation in Section </w:t>
       </w:r>
       <w:hyperlink w:anchor="sec:ablation">
         <w:r>
@@ -618,7 +615,7 @@
         <w:t xml:space="preserve"> </w:t>
       </w:r>
       <w:r>
-        <w:t xml:space="preserve">grid known to be exceptionally hard for restart-based search, we implemented five letter-level branching variants – three minimum-remaining-value scoring rules, a faithful reimplementation of a partition-based solver’s own candidate scoring, and a reversed scan order – reasoning that a smaller per-node branching factor should help on wide-open grids.</w:t>
+        <w:t xml:space="preserve">grid known to be exceptionally hard for restart-based search, we implemented five letter-level branching variants—three minimum-remaining-value scoring rules, a faithful reimplementation of a partition-based solver’s own candidate scoring, and a reversed scan order—reasoning that a smaller per-node branching factor should help on wide-open grids.</w:t>
       </w:r>
     </w:p>
     <w:p>
@@ -626,7 +623,7 @@
         <w:pStyle w:val="BodyText"/>
       </w:pPr>
       <w:r>
-        <w:t xml:space="preserve">All five produced numerically identical node and backtrack counts – too strong a signal to report as a simple null result, so we checked further. A plain counter in the branch-selection code, tracking how often the large-domain branch these heuristics govern actually executed, showed it firing</w:t>
+        <w:t xml:space="preserve">All five produced numerically identical node and backtrack counts—too strong a signal to report as a simple null result, so we checked further. A plain counter in the branch-selection code, tracking how often the large-domain branch these heuristics govern actually executed, showed it firing</w:t>
       </w:r>
       <w:r>
         <w:t xml:space="preserve"> </w:t>
@@ -686,7 +683,7 @@
         <w:pStyle w:val="FirstParagraph"/>
       </w:pPr>
       <w:r>
-        <w:t xml:space="preserve">The experiments below – enabled by Section </w:t>
+        <w:t xml:space="preserve">The experiments below—enabled by Section </w:t>
       </w:r>
       <w:hyperlink w:anchor="sec:negative">
         <w:r>
@@ -697,7 +694,7 @@
         </w:r>
       </w:hyperlink>
       <w:r>
-        <w:t xml:space="preserve">’s fix – test two distinct claims, kept in separate subsections rather than blended together. Section </w:t>
+        <w:t xml:space="preserve">’s fix—test two distinct claims, kept in separate subsections rather than blended together. Section </w:t>
       </w:r>
       <w:hyperlink w:anchor="sec:ablation">
         <w:r>
@@ -769,7 +766,7 @@
         <w:t xml:space="preserve"> </w:t>
       </w:r>
       <w:r>
-        <w:t xml:space="preserve">, against a dictionary derived deterministically from the repository’s own freely available word list, with a fixed seed and a 300-second cap, reproducible via</w:t>
+        <w:t xml:space="preserve">, against a dictionary derived deterministically from its own freely available word list, with a fixed seed and a 300-second cap, reproducible via</w:t>
       </w:r>
       <w:r>
         <w:t xml:space="preserve"> </w:t>
@@ -894,7 +891,7 @@
         <w:t xml:space="preserve"> </w:t>
       </w:r>
       <w:r>
-        <w:t xml:space="preserve">, all committed to the repository.</w:t>
+        <w:t xml:space="preserve">.</w:t>
       </w:r>
     </w:p>
     <w:bookmarkEnd w:id="13"/>
@@ -927,7 +924,7 @@
         <w:t xml:space="preserve"> </w:t>
       </w:r>
       <w:r>
-        <w:t xml:space="preserve">on and off, several trials each, on grids from two independent sources – a fixed</w:t>
+        <w:t xml:space="preserve">on and off, several trials each, on grids from two independent sources—a fixed</w:t>
       </w:r>
       <w:r>
         <w:t xml:space="preserve"> </w:t>
@@ -1208,7 +1205,7 @@
         <w:t xml:space="preserve"> </w:t>
       </w:r>
       <w:r>
-        <w:t xml:space="preserve">win on the former (36.9s vs. 271.4s median), and actively worse on the latter – all 5 trials hit the 300s cap, where disabling shared weights solves it reliably at</w:t>
+        <w:t xml:space="preserve">win on the former (36.9s vs. 271.4s median), and actively worse on the latter—all 5 trials hit the 300s cap, where disabling shared weights solves it reliably at</w:t>
       </w:r>
       <w:r>
         <w:t xml:space="preserve"> </w:t>
@@ -1251,7 +1248,7 @@
         <w:t xml:space="preserve"> </w:t>
       </w:r>
       <w:r>
-        <w:t xml:space="preserve">as the grid where xfill uniquely completes what orca-solver cannot – a completion advantage this ablation shows rests on exactly the unreliable configuration: shared weights on, the default. Against Section </w:t>
+        <w:t xml:space="preserve">as the grid where xfill uniquely completes what orca-solver cannot—a completion advantage this ablation shows rests on exactly the unreliable configuration: shared weights on, the default. Against Section </w:t>
       </w:r>
       <w:hyperlink w:anchor="sec:arch">
         <w:r>
@@ -1262,7 +1259,7 @@
         </w:r>
       </w:hyperlink>
       <w:r>
-        <w:t xml:space="preserve">’s broader-corpus finding of a consistent win, the synthesis is regime-dependent. Shared weights help on typical grids by redistributing which crossings each worker deprioritizes, but at the extreme difficulty end they trade tight, well-behaved variance for a wider one that is not reliably better, and sometimes reliably worse. We have no evidence for a uniform win, so we do not claim one – the same standard Section </w:t>
+        <w:t xml:space="preserve">’s broader-corpus finding of a consistent win, the synthesis is regime-dependent. Shared weights help on typical grids by redistributing which crossings each worker deprioritizes, but at the extreme difficulty end they trade tight, well-behaved variance for a wider one that is not reliably better, and sometimes reliably worse. We have no evidence for a uniform win, so we do not claim one—the same standard Section </w:t>
       </w:r>
       <w:hyperlink w:anchor="sec:negative">
         <w:r>
@@ -1423,7 +1420,7 @@
         <w:t xml:space="preserve">grid_120</w:t>
       </w:r>
       <w:r>
-        <w:t xml:space="preserve">, xfill’s wall time falls from 27.8s at 1 thread to 0.43s at 42 – a</w:t>
+        <w:t xml:space="preserve">, xfill’s wall time falls from 27.8s at 1 thread to 0.43s at 42—a</w:t>
       </w:r>
       <w:r>
         <w:t xml:space="preserve"> </w:t>
@@ -1443,7 +1440,7 @@
         <w:t xml:space="preserve"> </w:t>
       </w:r>
       <w:r>
-        <w:t xml:space="preserve">improvement – while orca-solver never solves it below 14 threads and only creeps from 27.3s to 17.9s from 14 to 42; on</w:t>
+        <w:t xml:space="preserve">improvement—while orca-solver never solves it below 14 threads and only creeps from 27.3s to 17.9s from 14 to 42; on</w:t>
       </w:r>
       <w:r>
         <w:t xml:space="preserve"> </w:t>
@@ -1483,7 +1480,7 @@
         <w:t xml:space="preserve">grid_115</w:t>
       </w:r>
       <w:r>
-        <w:t xml:space="preserve">, neither solver succeeds at any thread count – this one favors neither architecture. Where the pattern does hold, it holds because absorbing extra parallelism without restructuring the search is what a non-partitioning restart portfolio is built to do; a partition-based design here does not exhibit that capacity to nearly the same degree.</w:t>
+        <w:t xml:space="preserve">, neither solver succeeds at any thread count—this one favors neither architecture. Where the pattern does hold, it holds because absorbing extra parallelism without restructuring the search is what a non-partitioning restart portfolio is built to do; a partition-based design here does not exhibit that capacity to nearly the same degree.</w:t>
       </w:r>
     </w:p>
     <w:bookmarkStart w:id="27" w:name="fig:size"/>
@@ -1539,7 +1536,7 @@
         <w:pStyle w:val="ImageCaption"/>
       </w:pPr>
       <w:r>
-        <w:t xml:space="preserve">Time to solve or prove UNSAT by grid size, curated set, 1000s cap (log scale; open triangle = timed out). A solved/not-solved view of this same data would show xfill, orca-solver, and ingrid_core essentially tied, since all three succeed on the same grids here – the actual difference is that xfill’s line sits one to three orders of magnitude below the others at every size except</w:t>
+        <w:t xml:space="preserve">Time to solve or prove UNSAT by grid size, curated set, 1000s cap (log scale; open triangle = timed out). A solved/not-solved view of this same data would show xfill, orca-solver, and ingrid_core essentially tied, since all three succeed on the same grids here—the actual difference is that xfill’s line sits one to three orders of magnitude below the others at every size except</w:t>
       </w:r>
       <w:r>
         <w:t xml:space="preserve"> </w:t>
@@ -1615,7 +1612,7 @@
         </w:r>
       </w:hyperlink>
       <w:r>
-        <w:t xml:space="preserve">), the same advantage holds broadly, letting us test directly whether crossword-composer’s losses are a genuine baseline failure or just an under-provisioned time budget. Across all 20 grids, xfill resolved 19 (18 solved, 1 UNSAT; 1 timeout), orca-solver 18 (17 solved, 1 UNSAT; 2 timeouts), ingrid_core 17 (16 solved, 1 UNSAT; 3 timeouts), and crossword-composer 9 (8 solved, 1 UNSAT; 11 timeouts) – a real, unmodified, independently authored solver, not a strawman built to lose. Escalating the cap from 300s to 600s changed exactly one outcome: ingrid_core went on to solve</w:t>
+        <w:t xml:space="preserve">), the same advantage holds broadly, letting us test directly whether crossword-composer’s losses are a genuine baseline failure or just an under-provisioned time budget. Across all 20 grids, xfill resolved 19 (18 solved, 1 UNSAT; 1 timeout), orca-solver 18 (17 solved, 1 UNSAT; 2 timeouts), ingrid_core 17 (16 solved, 1 UNSAT; 3 timeouts), and crossword-composer 9 (8 solved, 1 UNSAT; 11 timeouts)—a real, unmodified, independently authored solver, not a strawman built to lose. Escalating the cap from 300s to 600s changed exactly one outcome: ingrid_core went on to solve</w:t>
       </w:r>
       <w:r>
         <w:t xml:space="preserve"> </w:t>
@@ -1630,7 +1627,7 @@
         <w:t xml:space="preserve"> </w:t>
       </w:r>
       <w:r>
-        <w:t xml:space="preserve">in 325s. A further escalation to 1000s – the cap these figures use – changed none: every remaining timeout, all 11 of crossword-composer’s plus</w:t>
+        <w:t xml:space="preserve">in 325s. A further escalation to 1000s—the cap these figures use—changed none: every remaining timeout, all 11 of crossword-composer’s plus</w:t>
       </w:r>
       <w:r>
         <w:t xml:space="preserve"> </w:t>
@@ -1651,7 +1648,7 @@
         <w:t xml:space="preserve">“xfill wins”</w:t>
       </w:r>
       <w:r>
-        <w:t xml:space="preserve">: at the grid and dictionary sizes crossword filling actually requires, restarts, adaptive heuristics, and parallelism are not optional refinements – they are the premise on which the rest of this section, and the mechanism this paper contributes, depend.</w:t>
+        <w:t xml:space="preserve">: at the grid and dictionary sizes crossword filling actually requires, restarts, adaptive heuristics, and parallelism are not optional refinements—they are the premise on which the rest of this section, and the mechanism this paper contributes, depend.</w:t>
       </w:r>
     </w:p>
     <w:bookmarkStart w:id="32" w:name="fig:speedup"/>
@@ -1839,10 +1836,7 @@
         <w:t xml:space="preserve"> </w:t>
       </w:r>
       <w:r>
-        <w:t xml:space="preserve"> </w:t>
-      </w:r>
-      <w:r>
-        <w:t xml:space="preserve">– realistic-scale grids, rather than the curated size-graded set, which mixes in small grids that inflate the ratio. Of the 11 scraped grids (of 12) both xfill and orca-solver solve, xfill is faster on 9, with a median speedup of</w:t>
+        <w:t xml:space="preserve">—realistic-scale grids, rather than the curated size-graded set, which mixes in small grids that inflate the ratio. Of the 11 scraped grids (of 12) both xfill and orca-solver solve, xfill is faster on 9, with a median speedup of</w:t>
       </w:r>
       <w:r>
         <w:t xml:space="preserve"> </w:t>
@@ -1943,10 +1937,7 @@
         </m:r>
       </m:oMath>
       <w:r>
-        <w:t xml:space="preserve"> </w:t>
-      </w:r>
-      <w:r>
-        <w:t xml:space="preserve">– consistent with</w:t>
+        <w:t xml:space="preserve">—consistent with</w:t>
       </w:r>
       <w:r>
         <w:t xml:space="preserve"> </w:t>
@@ -1984,7 +1975,7 @@
         <w:t xml:space="preserve">grid_423</w:t>
       </w:r>
       <w:r>
-        <w:t xml:space="preserve">, the twelfth scraped grid, sharpens this in the opposite direction: xfill solves it in 270s where orca-solver cannot, even at this paper’s full 1000s cap – a completion advantage, not just a speed one (revisited in Section </w:t>
+        <w:t xml:space="preserve">, the twelfth scraped grid, sharpens this in the opposite direction: xfill solves it in 270s where orca-solver cannot, even at this paper’s full 1000s cap—a completion advantage, not just a speed one (revisited in Section </w:t>
       </w:r>
       <w:hyperlink w:anchor="sec:ablation">
         <w:r>
@@ -2019,7 +2010,7 @@
         <w:t xml:space="preserve"> </w:t>
       </w:r>
       <w:r>
-        <w:t xml:space="preserve">being the other – a narrower gap on success alone than on speed, which is why Sections </w:t>
+        <w:t xml:space="preserve">being the other—a narrower gap on success alone than on speed, which is why Sections </w:t>
       </w:r>
       <w:hyperlink w:anchor="sec:scaling">
         <w:r>
@@ -2066,7 +2057,7 @@
         <w:pStyle w:val="FirstParagraph"/>
       </w:pPr>
       <w:r>
-        <w:t xml:space="preserve">The architectural comparison and the mechanism ablation share one underlying cause: restart portfolios benefit from heavy-tailed runtimes, so more independent draws raise the chance of an early lucky one, which is why oversubscribing thread count helped in Section </w:t>
+        <w:t xml:space="preserve">The architectural comparison and the mechanism ablation share one underlying cause: restart portfolios benefit from heavy-tailed runtimes, so more independent draws raise the chance of an early lucky one. This is why oversubscribing thread count helped in Section </w:t>
       </w:r>
       <w:hyperlink w:anchor="sec:oversub">
         <w:r>
@@ -2190,7 +2181,7 @@
         <w:t xml:space="preserve"> </w:t>
       </w:r>
       <w:r>
-        <w:t xml:space="preserve">supports that gap’s importance rather than being the paper’s subject – restart portfolios and partitioned search are suited respectively to finding solutions quickly and to proving none exist, a pattern independent of any one solver. The mechanism itself, tested in isolation, is more modest than the architecture it sits inside: a real win on typical grids, a wash or worse on the hardest ones, reported as measured rather than as hoped. We also reported a negative result from the same codebase – five heuristics rendered indistinguishable by a precondition that kept them from ever executing – as a reusable caution for comparing branching heuristics by benchmark score alone. Nothing about the mechanism itself is specific to crossword filling: it needs only a dom/wdeg-style weight table and a restart loop, both already common in CSP and lazy-clause-generation solvers – exactly the ingredients Section </w:t>
+        <w:t xml:space="preserve">supports that gap’s importance rather than being the paper’s subject—restart portfolios and partitioned search are suited respectively to finding solutions quickly and to proving none exist, a pattern independent of any one solver. The mechanism itself, tested in isolation, is more modest than the architecture it sits inside: a real win on typical grids, a wash or worse on the hardest ones, reported as measured rather than as hoped. We also reported a negative result from the same codebase—five heuristics rendered indistinguishable by a precondition that kept them from ever executing—as a reusable caution for comparing branching heuristics by benchmark score alone. Nothing about the mechanism itself is specific to crossword filling: it needs only a dom/wdeg-style weight table and a restart loop, both already common in CSP and lazy-clause-generation solvers—exactly the ingredients Section </w:t>
       </w:r>
       <w:hyperlink w:anchor="sec:relwork">
         <w:r>

</xml_diff>

<commit_message>
Fix grid_303 sentence to consistently lead with xfill as subject
Adjacent grid_120 clause already led with xfill ("xfill's wall time
falls..."); grid_303 led with orca-solver instead, an inconsistency
in an otherwise xfill-centered paragraph rather than a deliberate
choice. Reordered to match.

Co-Authored-By: Claude Sonnet 5 <noreply@anthropic.com>
</commit_message>
<xml_diff>
--- a/paper/xfill_urtc2026.docx
+++ b/paper/xfill_urtc2026.docx
@@ -1456,7 +1456,7 @@
         <w:t xml:space="preserve">grid_303</w:t>
       </w:r>
       <w:r>
-        <w:t xml:space="preserve">, orca-solver fails to solve it at</w:t>
+        <w:t xml:space="preserve">, xfill solves it (noisily, not monotonically) at 8, 14, and 42 threads, while orca-solver fails to solve it at</w:t>
       </w:r>
       <w:r>
         <w:t xml:space="preserve"> </w:t>
@@ -1472,7 +1472,7 @@
         <w:t xml:space="preserve"> </w:t>
       </w:r>
       <w:r>
-        <w:t xml:space="preserve">of the 7 thread counts tested, while xfill solves it (noisily, not monotonically) at 8, 14, and 42 threads; on</w:t>
+        <w:t xml:space="preserve">of the 7 thread counts tested; on</w:t>
       </w:r>
       <w:r>
         <w:t xml:space="preserve"> </w:t>

</xml_diff>

<commit_message>
Cite spreadthewordlist.com for the benchmark dictionary source
The word list underlying every solver's dictionary (data/spreadthewordlist_caps.txt)
was referenced by name in Setup's prose but never formally cited. Added
as a numbered reference using the same IEEE website-citation format
already used for crosswordgrids.com, with the accessed date matching
when the file was actually added to the repo (2026-07-22, per git log).

Co-Authored-By: Claude Sonnet 5 <noreply@anthropic.com>
</commit_message>
<xml_diff>
--- a/paper/xfill_urtc2026.docx
+++ b/paper/xfill_urtc2026.docx
@@ -770,7 +770,13 @@
         <w:t xml:space="preserve"> </w:t>
       </w:r>
       <w:r>
-        <w:t xml:space="preserve">, against a dictionary derived deterministically from its own freely available word list, with a fixed seed and a 300-second cap, reproducible via</w:t>
+        <w:t xml:space="preserve">, against a dictionary derived deterministically from its own freely available word list</w:t>
+      </w:r>
+      <w:r>
+        <w:t xml:space="preserve"> </w:t>
+      </w:r>
+      <w:r>
+        <w:t xml:space="preserve">, with a fixed seed and a 300-second cap, reproducible via</w:t>
       </w:r>
       <w:r>
         <w:t xml:space="preserve"> </w:t>
@@ -2203,7 +2209,7 @@
       </w:r>
     </w:p>
     <w:bookmarkEnd w:id="37"/>
-    <w:bookmarkStart w:id="40" w:name="acknowledgment"/>
+    <w:bookmarkStart w:id="41" w:name="acknowledgment"/>
     <w:p>
       <w:pPr>
         <w:pStyle w:val="Heading1"/>
@@ -2537,6 +2543,37 @@
         <w:pStyle w:val="BodyText"/>
       </w:pPr>
       <w:r>
+        <w:t xml:space="preserve">Spreadthewordlist.com.</w:t>
+      </w:r>
+      <w:r>
+        <w:t xml:space="preserve"> </w:t>
+      </w:r>
+      <w:r>
+        <w:t xml:space="preserve">“Spread the word(list).”</w:t>
+      </w:r>
+      <w:r>
+        <w:t xml:space="preserve"> </w:t>
+      </w:r>
+      <w:r>
+        <w:t xml:space="preserve">Accessed: Jul. 22, 2026. [Online.] Available:</w:t>
+      </w:r>
+      <w:r>
+        <w:t xml:space="preserve"> </w:t>
+      </w:r>
+      <w:hyperlink r:id="rId39">
+        <w:r>
+          <w:rPr>
+            <w:rStyle w:val="Hyperlink"/>
+          </w:rPr>
+          <w:t xml:space="preserve">https://www.spreadthewordlist.com/</w:t>
+        </w:r>
+      </w:hyperlink>
+    </w:p>
+    <w:p>
+      <w:pPr>
+        <w:pStyle w:val="BodyText"/>
+      </w:pPr>
+      <w:r>
         <w:t xml:space="preserve">L. K. Schreiber.</w:t>
       </w:r>
       <w:r>
@@ -2555,7 +2592,7 @@
       <w:r>
         <w:t xml:space="preserve"> </w:t>
       </w:r>
-      <w:hyperlink r:id="rId39">
+      <w:hyperlink r:id="rId40">
         <w:r>
           <w:rPr>
             <w:rStyle w:val="Hyperlink"/>
@@ -2564,7 +2601,7 @@
         </w:r>
       </w:hyperlink>
     </w:p>
-    <w:bookmarkEnd w:id="40"/>
+    <w:bookmarkEnd w:id="41"/>
     <w:sectPr>
       <w:footnotePr>
         <w:numRestart w:val="eachSect"/>

</xml_diff>

<commit_message>
Define "Resolved" in Table I -- it was never distinguished from "Solved"
Table I has both a "Solved" and a "Resolved" column sitting next to
each other, and nowhere in the paper is the relationship between them
stated. A reader has to reverse-engineer that Resolved = Solved +
UNSAT (i.e., reached a definitive answer either way, as opposed to
timing out) by doing the row arithmetic themselves. Given how visually
similar the two column names are, this is a real point of confusion,
not just a nice-to-have. Added the definition directly to the table
caption, where a reader looking at the table will actually see it.

Co-Authored-By: Claude Sonnet 5 <noreply@anthropic.com>
</commit_message>
<xml_diff>
--- a/paper/xfill_urtc2026.docx
+++ b/paper/xfill_urtc2026.docx
@@ -1678,7 +1678,7 @@
         <w:pStyle w:val="TableCaption"/>
       </w:pPr>
       <w:r>
-        <w:t xml:space="preserve">Solve Outcomes Across All 20 Grids, 1000s Cap</w:t>
+        <w:t xml:space="preserve">Solve Outcomes Across All 20 Grids, 1000s Cap (Resolved = Solved + UNSAT, i.e. not timed out)</w:t>
       </w:r>
     </w:p>
     <w:tbl>
@@ -1686,7 +1686,7 @@
         <w:tblStyle w:val="Table"/>
         <w:tblW w:type="auto" w:w="0"/>
         <w:tblLook w:firstRow="1" w:lastRow="0" w:firstColumn="0" w:lastColumn="0" w:noHBand="0" w:noVBand="0" w:val="0020"/>
-        <w:tblCaption w:val="Solve Outcomes Across All 20 Grids, 1000s Cap"/>
+        <w:tblCaption w:val="Solve Outcomes Across All 20 Grids, 1000s Cap (Resolved = Solved + UNSAT, i.e. not timed out)"/>
       </w:tblPr>
       <w:tblGrid>
         <w:gridCol w:w="1584"/>

</xml_diff>

<commit_message>
Rename Table I's "Resolved" column to "Decided"
"Resolved" sat right next to "Solved" as a column header and looked
enough like a synonym that a reader could easily read it as redundant
rather than as its own distinct quantity (Solved + UNSAT). Renamed to
"Decided" -- standard CS/logic terminology for a procedure that
terminates with a definitive yes/no answer, which is exactly what
distinguishes it from a timeout -- and updated the caption note and
the two places in the body text (Section V-E, V-F) that report these
same per-solver totals in prose, so the terminology stays consistent
end to end.

Co-Authored-By: Claude Sonnet 5 <noreply@anthropic.com>
</commit_message>
<xml_diff>
--- a/paper/xfill_urtc2026.docx
+++ b/paper/xfill_urtc2026.docx
@@ -1669,7 +1669,7 @@
         <w:t xml:space="preserve"> </w:t>
       </w:r>
       <w:r>
-        <w:t xml:space="preserve">summarizes the outcome: across all 20 grids, xfill resolved 19, orca-solver 18, ingrid_core 17, and crossword-composer only 9 – a real, unmodified, independently authored solver, not a strawman built to lose.</w:t>
+        <w:t xml:space="preserve">summarizes the outcome: across all 20 grids, xfill decided 19, orca-solver 18, ingrid_core 17, and crossword-composer only 9 – a real, unmodified, independently authored solver, not a strawman built to lose.</w:t>
       </w:r>
     </w:p>
     <w:bookmarkStart w:id="29" w:name="tab:outcomes"/>
@@ -1678,7 +1678,7 @@
         <w:pStyle w:val="TableCaption"/>
       </w:pPr>
       <w:r>
-        <w:t xml:space="preserve">Solve Outcomes Across All 20 Grids, 1000s Cap (Resolved = Solved + UNSAT, i.e. not timed out)</w:t>
+        <w:t xml:space="preserve">Solve Outcomes Across All 20 Grids, 1000s Cap (Decided = Solved + UNSAT)</w:t>
       </w:r>
     </w:p>
     <w:tbl>
@@ -1686,7 +1686,7 @@
         <w:tblStyle w:val="Table"/>
         <w:tblW w:type="auto" w:w="0"/>
         <w:tblLook w:firstRow="1" w:lastRow="0" w:firstColumn="0" w:lastColumn="0" w:noHBand="0" w:noVBand="0" w:val="0020"/>
-        <w:tblCaption w:val="Solve Outcomes Across All 20 Grids, 1000s Cap (Resolved = Solved + UNSAT, i.e. not timed out)"/>
+        <w:tblCaption w:val="Solve Outcomes Across All 20 Grids, 1000s Cap (Decided = Solved + UNSAT)"/>
       </w:tblPr>
       <w:tblGrid>
         <w:gridCol w:w="1584"/>
@@ -1755,7 +1755,7 @@
               <w:jc w:val="center"/>
             </w:pPr>
             <w:r>
-              <w:t xml:space="preserve">Resolved</w:t>
+              <w:t xml:space="preserve">Decided</w:t>
             </w:r>
           </w:p>
         </w:tc>
@@ -2389,7 +2389,7 @@
         </w:r>
       </w:hyperlink>
       <w:r>
-        <w:t xml:space="preserve">). Across the full 20-grid sample, xfill resolves 19, orca-solver 18, both agree on the sample’s one correct UNSAT proof, and xfill’s one failure (</w:t>
+        <w:t xml:space="preserve">). Across the full 20-grid sample, xfill decides 19, orca-solver 18, both agree on the sample’s one correct UNSAT proof, and xfill’s one failure (</w:t>
       </w:r>
       <w:r>
         <w:rPr>

</xml_diff>